<commit_message>
Realizando el entregable 4 implementando al menos un implementador y probanado con pytes y radon
</commit_message>
<xml_diff>
--- a/Informe_Lab06_SanCamilo.docx
+++ b/Informe_Lab06_SanCamilo.docx
@@ -131,7 +131,6 @@
             <w:pPr>
               <w:spacing w:after="40"/>
             </w:pPr>
-            <w:r/>
             <w:r>
               <w:rPr>
                 <w:b/>
@@ -181,7 +180,6 @@
             <w:pPr>
               <w:spacing w:after="40"/>
             </w:pPr>
-            <w:r/>
             <w:r>
               <w:rPr>
                 <w:b/>
@@ -228,7 +226,6 @@
             <w:pPr>
               <w:spacing w:after="40"/>
             </w:pPr>
-            <w:r/>
             <w:r>
               <w:rPr>
                 <w:b/>
@@ -271,7 +268,6 @@
             <w:pPr>
               <w:spacing w:after="40"/>
             </w:pPr>
-            <w:r/>
             <w:r>
               <w:rPr>
                 <w:b/>
@@ -314,7 +310,6 @@
             <w:pPr>
               <w:spacing w:after="40"/>
             </w:pPr>
-            <w:r/>
             <w:r>
               <w:rPr>
                 <w:b/>
@@ -363,7 +358,6 @@
             <w:pPr>
               <w:spacing w:after="40"/>
             </w:pPr>
-            <w:r/>
             <w:r>
               <w:rPr>
                 <w:b/>
@@ -408,7 +402,6 @@
             <w:pPr>
               <w:spacing w:after="40"/>
             </w:pPr>
-            <w:r/>
             <w:r>
               <w:rPr>
                 <w:b/>
@@ -433,17 +426,37 @@
             <w:pPr>
               <w:spacing w:after="40"/>
             </w:pPr>
-            <w:r/>
-            <w:r>
-              <w:rPr>
-                <w:b w:val="0"/>
+            <w:r>
+              <w:rPr>
                 <w:sz w:val="16"/>
               </w:rPr>
               <w:t>INTEGRANTES - GRUPO 07</w:t>
+            </w:r>
+            <w:r>
+              <w:rPr>
+                <w:sz w:val="16"/>
+              </w:rPr>
               <w:br/>
               <w:t>Mendoza Contreras, Giovani Angel</w:t>
+            </w:r>
+            <w:r>
+              <w:rPr>
+                <w:sz w:val="16"/>
+              </w:rPr>
               <w:br/>
-              <w:t>Yunque, Gustavo Alonso</w:t>
+              <w:t>Yunque</w:t>
+            </w:r>
+            <w:r>
+              <w:rPr>
+                <w:sz w:val="16"/>
+              </w:rPr>
+              <w:t xml:space="preserve"> Quispe</w:t>
+            </w:r>
+            <w:r>
+              <w:rPr>
+                <w:sz w:val="16"/>
+              </w:rPr>
+              <w:t xml:space="preserve"> Gustavo Alonso</w:t>
             </w:r>
           </w:p>
         </w:tc>
@@ -456,7 +469,6 @@
             <w:pPr>
               <w:spacing w:after="40"/>
             </w:pPr>
-            <w:r/>
             <w:r>
               <w:rPr>
                 <w:b/>
@@ -495,14 +507,32 @@
           <w:p>
             <w:pPr>
               <w:spacing w:after="40"/>
-            </w:pPr>
-            <w:r/>
-            <w:r>
-              <w:rPr>
-                <w:b w:val="0"/>
+              <w:rPr>
                 <w:sz w:val="16"/>
               </w:rPr>
+            </w:pPr>
+            <w:r>
+              <w:rPr>
+                <w:sz w:val="16"/>
+              </w:rPr>
               <w:t>DOCENTE: Mg. Antonio Arroyo Paz</w:t>
+            </w:r>
+            <w:r>
+              <w:rPr>
+                <w:sz w:val="16"/>
+              </w:rPr>
+              <w:t xml:space="preserve"> </w:t>
+            </w:r>
+          </w:p>
+          <w:p>
+            <w:pPr>
+              <w:spacing w:after="40"/>
+            </w:pPr>
+            <w:r>
+              <w:t xml:space="preserve">DOCENTE: Ing. </w:t>
+            </w:r>
+            <w:r>
+              <w:t>ALEXANDER JAVIER BENAVIDES ROJAS</w:t>
             </w:r>
           </w:p>
         </w:tc>
@@ -574,19 +604,70 @@
           <w:tcPr>
             <w:tcW w:w="10266" w:type="dxa"/>
           </w:tcPr>
-          <w:p>
-            <w:r/>
-          </w:p>
+          <w:p/>
           <w:p>
             <w:pPr>
               <w:spacing w:after="100" w:line="259" w:lineRule="auto"/>
-            </w:pPr>
-            <w:r>
               <w:rPr>
                 <w:sz w:val="20"/>
               </w:rPr>
+            </w:pPr>
+            <w:r>
+              <w:rPr>
+                <w:sz w:val="20"/>
+              </w:rPr>
               <w:t>Caso de estudio: San Camilo en Línea. El proyecto es un monolito modular para digitalizar el comercio del Mercado San Camilo de Arequipa. El modelo C4 mantiene coherencia con el ADR-001, los drivers arquitectónicos del Laboratorio 04 y los diagramas UML del Laboratorio 05.</w:t>
             </w:r>
+          </w:p>
+          <w:p>
+            <w:pPr>
+              <w:spacing w:after="100" w:line="259" w:lineRule="auto"/>
+              <w:rPr>
+                <w:sz w:val="20"/>
+              </w:rPr>
+            </w:pPr>
+            <w:proofErr w:type="gramStart"/>
+            <w:r>
+              <w:rPr>
+                <w:sz w:val="20"/>
+              </w:rPr>
+              <w:t>LINK</w:t>
+            </w:r>
+            <w:proofErr w:type="gramEnd"/>
+            <w:r>
+              <w:rPr>
+                <w:sz w:val="20"/>
+              </w:rPr>
+              <w:t xml:space="preserve"> GITHUB: </w:t>
+            </w:r>
+            <w:hyperlink r:id="rId8" w:history="1">
+              <w:r>
+                <w:rPr>
+                  <w:rStyle w:val="Hipervnculo"/>
+                  <w:sz w:val="20"/>
+                </w:rPr>
+                <w:t>https://github.com/giovani2</w:t>
+              </w:r>
+              <w:r>
+                <w:rPr>
+                  <w:rStyle w:val="Hipervnculo"/>
+                  <w:sz w:val="20"/>
+                </w:rPr>
+                <w:t>0</w:t>
+              </w:r>
+              <w:r>
+                <w:rPr>
+                  <w:rStyle w:val="Hipervnculo"/>
+                  <w:sz w:val="20"/>
+                </w:rPr>
+                <w:t>2320/Costruccion_Software</w:t>
+              </w:r>
+            </w:hyperlink>
+          </w:p>
+          <w:p>
+            <w:pPr>
+              <w:spacing w:after="100" w:line="259" w:lineRule="auto"/>
+            </w:pPr>
           </w:p>
           <w:p>
             <w:pPr>
@@ -614,8 +695,7 @@
           </w:p>
           <w:tbl>
             <w:tblPr>
-              <w:tblW w:type="auto" w:w="0"/>
-              <w:tblLook w:firstColumn="1" w:firstRow="1" w:lastColumn="0" w:lastRow="0" w:noHBand="0" w:noVBand="1" w:val="04A0"/>
+              <w:tblW w:w="0" w:type="auto"/>
               <w:tblBorders>
                 <w:top w:val="single" w:sz="4" w:space="0" w:color="D9D9D9"/>
                 <w:left w:val="single" w:sz="4" w:space="0" w:color="D9D9D9"/>
@@ -624,6 +704,7 @@
                 <w:insideH w:val="single" w:sz="4" w:space="0" w:color="D9D9D9"/>
                 <w:insideV w:val="single" w:sz="4" w:space="0" w:color="D9D9D9"/>
               </w:tblBorders>
+              <w:tblLook w:val="04A0" w:firstRow="1" w:lastRow="0" w:firstColumn="1" w:lastColumn="0" w:noHBand="0" w:noVBand="1"/>
             </w:tblPr>
             <w:tblGrid>
               <w:gridCol w:w="3422"/>
@@ -633,15 +714,14 @@
             <w:tr>
               <w:tc>
                 <w:tcPr>
-                  <w:tcW w:type="dxa" w:w="3422"/>
-                  <w:vAlign w:val="center"/>
-                  <w:shd w:fill="1F4E78"/>
-                </w:tcPr>
-                <w:p>
-                  <w:pPr>
-                    <w:spacing w:after="40"/>
-                  </w:pPr>
-                  <w:r/>
+                  <w:tcW w:w="3422" w:type="dxa"/>
+                  <w:shd w:val="clear" w:color="auto" w:fill="1F4E78"/>
+                  <w:vAlign w:val="center"/>
+                </w:tcPr>
+                <w:p>
+                  <w:pPr>
+                    <w:spacing w:after="40"/>
+                  </w:pPr>
                   <w:r>
                     <w:rPr>
                       <w:b/>
@@ -654,15 +734,14 @@
               </w:tc>
               <w:tc>
                 <w:tcPr>
-                  <w:tcW w:type="dxa" w:w="3422"/>
-                  <w:vAlign w:val="center"/>
-                  <w:shd w:fill="1F4E78"/>
-                </w:tcPr>
-                <w:p>
-                  <w:pPr>
-                    <w:spacing w:after="40"/>
-                  </w:pPr>
-                  <w:r/>
+                  <w:tcW w:w="3422" w:type="dxa"/>
+                  <w:shd w:val="clear" w:color="auto" w:fill="1F4E78"/>
+                  <w:vAlign w:val="center"/>
+                </w:tcPr>
+                <w:p>
+                  <w:pPr>
+                    <w:spacing w:after="40"/>
+                  </w:pPr>
                   <w:r>
                     <w:rPr>
                       <w:b/>
@@ -675,15 +754,14 @@
               </w:tc>
               <w:tc>
                 <w:tcPr>
-                  <w:tcW w:type="dxa" w:w="3422"/>
-                  <w:vAlign w:val="center"/>
-                  <w:shd w:fill="1F4E78"/>
-                </w:tcPr>
-                <w:p>
-                  <w:pPr>
-                    <w:spacing w:after="40"/>
-                  </w:pPr>
-                  <w:r/>
+                  <w:tcW w:w="3422" w:type="dxa"/>
+                  <w:shd w:val="clear" w:color="auto" w:fill="1F4E78"/>
+                  <w:vAlign w:val="center"/>
+                </w:tcPr>
+                <w:p>
+                  <w:pPr>
+                    <w:spacing w:after="40"/>
+                  </w:pPr>
                   <w:r>
                     <w:rPr>
                       <w:b/>
@@ -698,17 +776,15 @@
             <w:tr>
               <w:tc>
                 <w:tcPr>
-                  <w:tcW w:type="dxa" w:w="3422"/>
-                  <w:vAlign w:val="center"/>
-                </w:tcPr>
-                <w:p>
-                  <w:pPr>
-                    <w:spacing w:after="40"/>
-                  </w:pPr>
-                  <w:r/>
-                  <w:r>
-                    <w:rPr>
-                      <w:b w:val="0"/>
+                  <w:tcW w:w="3422" w:type="dxa"/>
+                  <w:vAlign w:val="center"/>
+                </w:tcPr>
+                <w:p>
+                  <w:pPr>
+                    <w:spacing w:after="40"/>
+                  </w:pPr>
+                  <w:r>
+                    <w:rPr>
                       <w:sz w:val="16"/>
                     </w:rPr>
                     <w:t>Cliente</w:t>
@@ -717,17 +793,15 @@
               </w:tc>
               <w:tc>
                 <w:tcPr>
-                  <w:tcW w:type="dxa" w:w="3422"/>
-                  <w:vAlign w:val="center"/>
-                </w:tcPr>
-                <w:p>
-                  <w:pPr>
-                    <w:spacing w:after="40"/>
-                  </w:pPr>
-                  <w:r/>
-                  <w:r>
-                    <w:rPr>
-                      <w:b w:val="0"/>
+                  <w:tcW w:w="3422" w:type="dxa"/>
+                  <w:vAlign w:val="center"/>
+                </w:tcPr>
+                <w:p>
+                  <w:pPr>
+                    <w:spacing w:after="40"/>
+                  </w:pPr>
+                  <w:r>
+                    <w:rPr>
                       <w:sz w:val="16"/>
                     </w:rPr>
                     <w:t>Persona</w:t>
@@ -736,17 +810,15 @@
               </w:tc>
               <w:tc>
                 <w:tcPr>
-                  <w:tcW w:type="dxa" w:w="3422"/>
-                  <w:vAlign w:val="center"/>
-                </w:tcPr>
-                <w:p>
-                  <w:pPr>
-                    <w:spacing w:after="40"/>
-                  </w:pPr>
-                  <w:r/>
-                  <w:r>
-                    <w:rPr>
-                      <w:b w:val="0"/>
+                  <w:tcW w:w="3422" w:type="dxa"/>
+                  <w:vAlign w:val="center"/>
+                </w:tcPr>
+                <w:p>
+                  <w:pPr>
+                    <w:spacing w:after="40"/>
+                  </w:pPr>
+                  <w:r>
+                    <w:rPr>
                       <w:sz w:val="16"/>
                     </w:rPr>
                     <w:t>Compra productos de varios puestos, registra el pago y consulta el pedido.</w:t>
@@ -757,18 +829,16 @@
             <w:tr>
               <w:tc>
                 <w:tcPr>
-                  <w:tcW w:type="dxa" w:w="3422"/>
-                  <w:vAlign w:val="center"/>
-                  <w:shd w:fill="EAF2F8"/>
-                </w:tcPr>
-                <w:p>
-                  <w:pPr>
-                    <w:spacing w:after="40"/>
-                  </w:pPr>
-                  <w:r/>
-                  <w:r>
-                    <w:rPr>
-                      <w:b w:val="0"/>
+                  <w:tcW w:w="3422" w:type="dxa"/>
+                  <w:shd w:val="clear" w:color="auto" w:fill="EAF2F8"/>
+                  <w:vAlign w:val="center"/>
+                </w:tcPr>
+                <w:p>
+                  <w:pPr>
+                    <w:spacing w:after="40"/>
+                  </w:pPr>
+                  <w:r>
+                    <w:rPr>
                       <w:sz w:val="16"/>
                     </w:rPr>
                     <w:t>Comerciante</w:t>
@@ -777,18 +847,16 @@
               </w:tc>
               <w:tc>
                 <w:tcPr>
-                  <w:tcW w:type="dxa" w:w="3422"/>
-                  <w:vAlign w:val="center"/>
-                  <w:shd w:fill="EAF2F8"/>
-                </w:tcPr>
-                <w:p>
-                  <w:pPr>
-                    <w:spacing w:after="40"/>
-                  </w:pPr>
-                  <w:r/>
-                  <w:r>
-                    <w:rPr>
-                      <w:b w:val="0"/>
+                  <w:tcW w:w="3422" w:type="dxa"/>
+                  <w:shd w:val="clear" w:color="auto" w:fill="EAF2F8"/>
+                  <w:vAlign w:val="center"/>
+                </w:tcPr>
+                <w:p>
+                  <w:pPr>
+                    <w:spacing w:after="40"/>
+                  </w:pPr>
+                  <w:r>
+                    <w:rPr>
                       <w:sz w:val="16"/>
                     </w:rPr>
                     <w:t>Persona</w:t>
@@ -797,18 +865,16 @@
               </w:tc>
               <w:tc>
                 <w:tcPr>
-                  <w:tcW w:type="dxa" w:w="3422"/>
-                  <w:vAlign w:val="center"/>
-                  <w:shd w:fill="EAF2F8"/>
-                </w:tcPr>
-                <w:p>
-                  <w:pPr>
-                    <w:spacing w:after="40"/>
-                  </w:pPr>
-                  <w:r/>
-                  <w:r>
-                    <w:rPr>
-                      <w:b w:val="0"/>
+                  <w:tcW w:w="3422" w:type="dxa"/>
+                  <w:shd w:val="clear" w:color="auto" w:fill="EAF2F8"/>
+                  <w:vAlign w:val="center"/>
+                </w:tcPr>
+                <w:p>
+                  <w:pPr>
+                    <w:spacing w:after="40"/>
+                  </w:pPr>
+                  <w:r>
+                    <w:rPr>
                       <w:sz w:val="16"/>
                     </w:rPr>
                     <w:t>Publica productos y prepara las subórdenes.</w:t>
@@ -819,17 +885,15 @@
             <w:tr>
               <w:tc>
                 <w:tcPr>
-                  <w:tcW w:type="dxa" w:w="3422"/>
-                  <w:vAlign w:val="center"/>
-                </w:tcPr>
-                <w:p>
-                  <w:pPr>
-                    <w:spacing w:after="40"/>
-                  </w:pPr>
-                  <w:r/>
-                  <w:r>
-                    <w:rPr>
-                      <w:b w:val="0"/>
+                  <w:tcW w:w="3422" w:type="dxa"/>
+                  <w:vAlign w:val="center"/>
+                </w:tcPr>
+                <w:p>
+                  <w:pPr>
+                    <w:spacing w:after="40"/>
+                  </w:pPr>
+                  <w:r>
+                    <w:rPr>
                       <w:sz w:val="16"/>
                     </w:rPr>
                     <w:t>Repartidor</w:t>
@@ -838,17 +902,15 @@
               </w:tc>
               <w:tc>
                 <w:tcPr>
-                  <w:tcW w:type="dxa" w:w="3422"/>
-                  <w:vAlign w:val="center"/>
-                </w:tcPr>
-                <w:p>
-                  <w:pPr>
-                    <w:spacing w:after="40"/>
-                  </w:pPr>
-                  <w:r/>
-                  <w:r>
-                    <w:rPr>
-                      <w:b w:val="0"/>
+                  <w:tcW w:w="3422" w:type="dxa"/>
+                  <w:vAlign w:val="center"/>
+                </w:tcPr>
+                <w:p>
+                  <w:pPr>
+                    <w:spacing w:after="40"/>
+                  </w:pPr>
+                  <w:r>
+                    <w:rPr>
                       <w:sz w:val="16"/>
                     </w:rPr>
                     <w:t>Persona</w:t>
@@ -857,17 +919,15 @@
               </w:tc>
               <w:tc>
                 <w:tcPr>
-                  <w:tcW w:type="dxa" w:w="3422"/>
-                  <w:vAlign w:val="center"/>
-                </w:tcPr>
-                <w:p>
-                  <w:pPr>
-                    <w:spacing w:after="40"/>
-                  </w:pPr>
-                  <w:r/>
-                  <w:r>
-                    <w:rPr>
-                      <w:b w:val="0"/>
+                  <w:tcW w:w="3422" w:type="dxa"/>
+                  <w:vAlign w:val="center"/>
+                </w:tcPr>
+                <w:p>
+                  <w:pPr>
+                    <w:spacing w:after="40"/>
+                  </w:pPr>
+                  <w:r>
+                    <w:rPr>
                       <w:sz w:val="16"/>
                     </w:rPr>
                     <w:t>Gestiona entregas con modalidad delivery.</w:t>
@@ -878,18 +938,16 @@
             <w:tr>
               <w:tc>
                 <w:tcPr>
-                  <w:tcW w:type="dxa" w:w="3422"/>
-                  <w:vAlign w:val="center"/>
-                  <w:shd w:fill="EAF2F8"/>
-                </w:tcPr>
-                <w:p>
-                  <w:pPr>
-                    <w:spacing w:after="40"/>
-                  </w:pPr>
-                  <w:r/>
-                  <w:r>
-                    <w:rPr>
-                      <w:b w:val="0"/>
+                  <w:tcW w:w="3422" w:type="dxa"/>
+                  <w:shd w:val="clear" w:color="auto" w:fill="EAF2F8"/>
+                  <w:vAlign w:val="center"/>
+                </w:tcPr>
+                <w:p>
+                  <w:pPr>
+                    <w:spacing w:after="40"/>
+                  </w:pPr>
+                  <w:r>
+                    <w:rPr>
                       <w:sz w:val="16"/>
                     </w:rPr>
                     <w:t>Administrador</w:t>
@@ -898,18 +956,16 @@
               </w:tc>
               <w:tc>
                 <w:tcPr>
-                  <w:tcW w:type="dxa" w:w="3422"/>
-                  <w:vAlign w:val="center"/>
-                  <w:shd w:fill="EAF2F8"/>
-                </w:tcPr>
-                <w:p>
-                  <w:pPr>
-                    <w:spacing w:after="40"/>
-                  </w:pPr>
-                  <w:r/>
-                  <w:r>
-                    <w:rPr>
-                      <w:b w:val="0"/>
+                  <w:tcW w:w="3422" w:type="dxa"/>
+                  <w:shd w:val="clear" w:color="auto" w:fill="EAF2F8"/>
+                  <w:vAlign w:val="center"/>
+                </w:tcPr>
+                <w:p>
+                  <w:pPr>
+                    <w:spacing w:after="40"/>
+                  </w:pPr>
+                  <w:r>
+                    <w:rPr>
                       <w:sz w:val="16"/>
                     </w:rPr>
                     <w:t>Persona</w:t>
@@ -918,18 +974,16 @@
               </w:tc>
               <w:tc>
                 <w:tcPr>
-                  <w:tcW w:type="dxa" w:w="3422"/>
-                  <w:vAlign w:val="center"/>
-                  <w:shd w:fill="EAF2F8"/>
-                </w:tcPr>
-                <w:p>
-                  <w:pPr>
-                    <w:spacing w:after="40"/>
-                  </w:pPr>
-                  <w:r/>
-                  <w:r>
-                    <w:rPr>
-                      <w:b w:val="0"/>
+                  <w:tcW w:w="3422" w:type="dxa"/>
+                  <w:shd w:val="clear" w:color="auto" w:fill="EAF2F8"/>
+                  <w:vAlign w:val="center"/>
+                </w:tcPr>
+                <w:p>
+                  <w:pPr>
+                    <w:spacing w:after="40"/>
+                  </w:pPr>
+                  <w:r>
+                    <w:rPr>
                       <w:sz w:val="16"/>
                     </w:rPr>
                     <w:t>Verifica comprobantes y supervisa la operación.</w:t>
@@ -940,17 +994,15 @@
             <w:tr>
               <w:tc>
                 <w:tcPr>
-                  <w:tcW w:type="dxa" w:w="3422"/>
-                  <w:vAlign w:val="center"/>
-                </w:tcPr>
-                <w:p>
-                  <w:pPr>
-                    <w:spacing w:after="40"/>
-                  </w:pPr>
-                  <w:r/>
-                  <w:r>
-                    <w:rPr>
-                      <w:b w:val="0"/>
+                  <w:tcW w:w="3422" w:type="dxa"/>
+                  <w:vAlign w:val="center"/>
+                </w:tcPr>
+                <w:p>
+                  <w:pPr>
+                    <w:spacing w:after="40"/>
+                  </w:pPr>
+                  <w:r>
+                    <w:rPr>
                       <w:sz w:val="16"/>
                     </w:rPr>
                     <w:t>San Camilo en Línea</w:t>
@@ -959,17 +1011,15 @@
               </w:tc>
               <w:tc>
                 <w:tcPr>
-                  <w:tcW w:type="dxa" w:w="3422"/>
-                  <w:vAlign w:val="center"/>
-                </w:tcPr>
-                <w:p>
-                  <w:pPr>
-                    <w:spacing w:after="40"/>
-                  </w:pPr>
-                  <w:r/>
-                  <w:r>
-                    <w:rPr>
-                      <w:b w:val="0"/>
+                  <w:tcW w:w="3422" w:type="dxa"/>
+                  <w:vAlign w:val="center"/>
+                </w:tcPr>
+                <w:p>
+                  <w:pPr>
+                    <w:spacing w:after="40"/>
+                  </w:pPr>
+                  <w:r>
+                    <w:rPr>
                       <w:sz w:val="16"/>
                     </w:rPr>
                     <w:t>Sistema</w:t>
@@ -978,17 +1028,15 @@
               </w:tc>
               <w:tc>
                 <w:tcPr>
-                  <w:tcW w:type="dxa" w:w="3422"/>
-                  <w:vAlign w:val="center"/>
-                </w:tcPr>
-                <w:p>
-                  <w:pPr>
-                    <w:spacing w:after="40"/>
-                  </w:pPr>
-                  <w:r/>
-                  <w:r>
-                    <w:rPr>
-                      <w:b w:val="0"/>
+                  <w:tcW w:w="3422" w:type="dxa"/>
+                  <w:vAlign w:val="center"/>
+                </w:tcPr>
+                <w:p>
+                  <w:pPr>
+                    <w:spacing w:after="40"/>
+                  </w:pPr>
+                  <w:r>
+                    <w:rPr>
                       <w:sz w:val="16"/>
                     </w:rPr>
                     <w:t>Catálogo, pedidos multi-puesto, pagos y coordinación de entregas.</w:t>
@@ -999,18 +1047,16 @@
             <w:tr>
               <w:tc>
                 <w:tcPr>
-                  <w:tcW w:type="dxa" w:w="3422"/>
-                  <w:vAlign w:val="center"/>
-                  <w:shd w:fill="EAF2F8"/>
-                </w:tcPr>
-                <w:p>
-                  <w:pPr>
-                    <w:spacing w:after="40"/>
-                  </w:pPr>
-                  <w:r/>
-                  <w:r>
-                    <w:rPr>
-                      <w:b w:val="0"/>
+                  <w:tcW w:w="3422" w:type="dxa"/>
+                  <w:shd w:val="clear" w:color="auto" w:fill="EAF2F8"/>
+                  <w:vAlign w:val="center"/>
+                </w:tcPr>
+                <w:p>
+                  <w:pPr>
+                    <w:spacing w:after="40"/>
+                  </w:pPr>
+                  <w:r>
+                    <w:rPr>
                       <w:sz w:val="16"/>
                     </w:rPr>
                     <w:t>Yape / Plin</w:t>
@@ -1019,18 +1065,16 @@
               </w:tc>
               <w:tc>
                 <w:tcPr>
-                  <w:tcW w:type="dxa" w:w="3422"/>
-                  <w:vAlign w:val="center"/>
-                  <w:shd w:fill="EAF2F8"/>
-                </w:tcPr>
-                <w:p>
-                  <w:pPr>
-                    <w:spacing w:after="40"/>
-                  </w:pPr>
-                  <w:r/>
-                  <w:r>
-                    <w:rPr>
-                      <w:b w:val="0"/>
+                  <w:tcW w:w="3422" w:type="dxa"/>
+                  <w:shd w:val="clear" w:color="auto" w:fill="EAF2F8"/>
+                  <w:vAlign w:val="center"/>
+                </w:tcPr>
+                <w:p>
+                  <w:pPr>
+                    <w:spacing w:after="40"/>
+                  </w:pPr>
+                  <w:r>
+                    <w:rPr>
                       <w:sz w:val="16"/>
                     </w:rPr>
                     <w:t>Sistema externo</w:t>
@@ -1039,18 +1083,16 @@
               </w:tc>
               <w:tc>
                 <w:tcPr>
-                  <w:tcW w:type="dxa" w:w="3422"/>
-                  <w:vAlign w:val="center"/>
-                  <w:shd w:fill="EAF2F8"/>
-                </w:tcPr>
-                <w:p>
-                  <w:pPr>
-                    <w:spacing w:after="40"/>
-                  </w:pPr>
-                  <w:r/>
-                  <w:r>
-                    <w:rPr>
-                      <w:b w:val="0"/>
+                  <w:tcW w:w="3422" w:type="dxa"/>
+                  <w:shd w:val="clear" w:color="auto" w:fill="EAF2F8"/>
+                  <w:vAlign w:val="center"/>
+                </w:tcPr>
+                <w:p>
+                  <w:pPr>
+                    <w:spacing w:after="40"/>
+                  </w:pPr>
+                  <w:r>
+                    <w:rPr>
                       <w:sz w:val="16"/>
                     </w:rPr>
                     <w:t>Billeteras y comprobantes de transferencia.</w:t>
@@ -1061,17 +1103,15 @@
             <w:tr>
               <w:tc>
                 <w:tcPr>
-                  <w:tcW w:type="dxa" w:w="3422"/>
-                  <w:vAlign w:val="center"/>
-                </w:tcPr>
-                <w:p>
-                  <w:pPr>
-                    <w:spacing w:after="40"/>
-                  </w:pPr>
-                  <w:r/>
-                  <w:r>
-                    <w:rPr>
-                      <w:b w:val="0"/>
+                  <w:tcW w:w="3422" w:type="dxa"/>
+                  <w:vAlign w:val="center"/>
+                </w:tcPr>
+                <w:p>
+                  <w:pPr>
+                    <w:spacing w:after="40"/>
+                  </w:pPr>
+                  <w:r>
+                    <w:rPr>
                       <w:sz w:val="16"/>
                     </w:rPr>
                     <w:t>WhatsApp Business API / wa.me</w:t>
@@ -1080,17 +1120,15 @@
               </w:tc>
               <w:tc>
                 <w:tcPr>
-                  <w:tcW w:type="dxa" w:w="3422"/>
-                  <w:vAlign w:val="center"/>
-                </w:tcPr>
-                <w:p>
-                  <w:pPr>
-                    <w:spacing w:after="40"/>
-                  </w:pPr>
-                  <w:r/>
-                  <w:r>
-                    <w:rPr>
-                      <w:b w:val="0"/>
+                  <w:tcW w:w="3422" w:type="dxa"/>
+                  <w:vAlign w:val="center"/>
+                </w:tcPr>
+                <w:p>
+                  <w:pPr>
+                    <w:spacing w:after="40"/>
+                  </w:pPr>
+                  <w:r>
+                    <w:rPr>
                       <w:sz w:val="16"/>
                     </w:rPr>
                     <w:t>Sistema externo</w:t>
@@ -1099,17 +1137,15 @@
               </w:tc>
               <w:tc>
                 <w:tcPr>
-                  <w:tcW w:type="dxa" w:w="3422"/>
-                  <w:vAlign w:val="center"/>
-                </w:tcPr>
-                <w:p>
-                  <w:pPr>
-                    <w:spacing w:after="40"/>
-                  </w:pPr>
-                  <w:r/>
-                  <w:r>
-                    <w:rPr>
-                      <w:b w:val="0"/>
+                  <w:tcW w:w="3422" w:type="dxa"/>
+                  <w:vAlign w:val="center"/>
+                </w:tcPr>
+                <w:p>
+                  <w:pPr>
+                    <w:spacing w:after="40"/>
+                  </w:pPr>
+                  <w:r>
+                    <w:rPr>
                       <w:sz w:val="16"/>
                     </w:rPr>
                     <w:t>Canal de avisos al comerciante.</w:t>
@@ -1145,8 +1181,7 @@
           </w:p>
           <w:tbl>
             <w:tblPr>
-              <w:tblW w:type="auto" w:w="0"/>
-              <w:tblLook w:firstColumn="1" w:firstRow="1" w:lastColumn="0" w:lastRow="0" w:noHBand="0" w:noVBand="1" w:val="04A0"/>
+              <w:tblW w:w="0" w:type="auto"/>
               <w:tblBorders>
                 <w:top w:val="single" w:sz="4" w:space="0" w:color="D9D9D9"/>
                 <w:left w:val="single" w:sz="4" w:space="0" w:color="D9D9D9"/>
@@ -1155,6 +1190,7 @@
                 <w:insideH w:val="single" w:sz="4" w:space="0" w:color="D9D9D9"/>
                 <w:insideV w:val="single" w:sz="4" w:space="0" w:color="D9D9D9"/>
               </w:tblBorders>
+              <w:tblLook w:val="04A0" w:firstRow="1" w:lastRow="0" w:firstColumn="1" w:lastColumn="0" w:noHBand="0" w:noVBand="1"/>
             </w:tblPr>
             <w:tblGrid>
               <w:gridCol w:w="3422"/>
@@ -1164,15 +1200,14 @@
             <w:tr>
               <w:tc>
                 <w:tcPr>
-                  <w:tcW w:type="dxa" w:w="3422"/>
-                  <w:vAlign w:val="center"/>
-                  <w:shd w:fill="1F4E78"/>
-                </w:tcPr>
-                <w:p>
-                  <w:pPr>
-                    <w:spacing w:after="40"/>
-                  </w:pPr>
-                  <w:r/>
+                  <w:tcW w:w="3422" w:type="dxa"/>
+                  <w:shd w:val="clear" w:color="auto" w:fill="1F4E78"/>
+                  <w:vAlign w:val="center"/>
+                </w:tcPr>
+                <w:p>
+                  <w:pPr>
+                    <w:spacing w:after="40"/>
+                  </w:pPr>
                   <w:r>
                     <w:rPr>
                       <w:b/>
@@ -1185,15 +1220,14 @@
               </w:tc>
               <w:tc>
                 <w:tcPr>
-                  <w:tcW w:type="dxa" w:w="3422"/>
-                  <w:vAlign w:val="center"/>
-                  <w:shd w:fill="1F4E78"/>
-                </w:tcPr>
-                <w:p>
-                  <w:pPr>
-                    <w:spacing w:after="40"/>
-                  </w:pPr>
-                  <w:r/>
+                  <w:tcW w:w="3422" w:type="dxa"/>
+                  <w:shd w:val="clear" w:color="auto" w:fill="1F4E78"/>
+                  <w:vAlign w:val="center"/>
+                </w:tcPr>
+                <w:p>
+                  <w:pPr>
+                    <w:spacing w:after="40"/>
+                  </w:pPr>
                   <w:r>
                     <w:rPr>
                       <w:b/>
@@ -1206,15 +1240,14 @@
               </w:tc>
               <w:tc>
                 <w:tcPr>
-                  <w:tcW w:type="dxa" w:w="3422"/>
-                  <w:vAlign w:val="center"/>
-                  <w:shd w:fill="1F4E78"/>
-                </w:tcPr>
-                <w:p>
-                  <w:pPr>
-                    <w:spacing w:after="40"/>
-                  </w:pPr>
-                  <w:r/>
+                  <w:tcW w:w="3422" w:type="dxa"/>
+                  <w:shd w:val="clear" w:color="auto" w:fill="1F4E78"/>
+                  <w:vAlign w:val="center"/>
+                </w:tcPr>
+                <w:p>
+                  <w:pPr>
+                    <w:spacing w:after="40"/>
+                  </w:pPr>
                   <w:r>
                     <w:rPr>
                       <w:b/>
@@ -1229,17 +1262,15 @@
             <w:tr>
               <w:tc>
                 <w:tcPr>
-                  <w:tcW w:type="dxa" w:w="3422"/>
-                  <w:vAlign w:val="center"/>
-                </w:tcPr>
-                <w:p>
-                  <w:pPr>
-                    <w:spacing w:after="40"/>
-                  </w:pPr>
-                  <w:r/>
-                  <w:r>
-                    <w:rPr>
-                      <w:b w:val="0"/>
+                  <w:tcW w:w="3422" w:type="dxa"/>
+                  <w:vAlign w:val="center"/>
+                </w:tcPr>
+                <w:p>
+                  <w:pPr>
+                    <w:spacing w:after="40"/>
+                  </w:pPr>
+                  <w:r>
+                    <w:rPr>
                       <w:sz w:val="16"/>
                     </w:rPr>
                     <w:t>PWA móvil</w:t>
@@ -1248,17 +1279,15 @@
               </w:tc>
               <w:tc>
                 <w:tcPr>
-                  <w:tcW w:type="dxa" w:w="3422"/>
-                  <w:vAlign w:val="center"/>
-                </w:tcPr>
-                <w:p>
-                  <w:pPr>
-                    <w:spacing w:after="40"/>
-                  </w:pPr>
-                  <w:r/>
-                  <w:r>
-                    <w:rPr>
-                      <w:b w:val="0"/>
+                  <w:tcW w:w="3422" w:type="dxa"/>
+                  <w:vAlign w:val="center"/>
+                </w:tcPr>
+                <w:p>
+                  <w:pPr>
+                    <w:spacing w:after="40"/>
+                  </w:pPr>
+                  <w:r>
+                    <w:rPr>
                       <w:sz w:val="16"/>
                     </w:rPr>
                     <w:t>HTML5, TailwindCSS, JavaScript, Service Worker</w:t>
@@ -1267,17 +1296,15 @@
               </w:tc>
               <w:tc>
                 <w:tcPr>
-                  <w:tcW w:type="dxa" w:w="3422"/>
-                  <w:vAlign w:val="center"/>
-                </w:tcPr>
-                <w:p>
-                  <w:pPr>
-                    <w:spacing w:after="40"/>
-                  </w:pPr>
-                  <w:r/>
-                  <w:r>
-                    <w:rPr>
-                      <w:b w:val="0"/>
+                  <w:tcW w:w="3422" w:type="dxa"/>
+                  <w:vAlign w:val="center"/>
+                </w:tcPr>
+                <w:p>
+                  <w:pPr>
+                    <w:spacing w:after="40"/>
+                  </w:pPr>
+                  <w:r>
+                    <w:rPr>
                       <w:sz w:val="16"/>
                     </w:rPr>
                     <w:t>Interfaz para clientes, comerciantes, repartidores y administradores.</w:t>
@@ -1288,38 +1315,35 @@
             <w:tr>
               <w:tc>
                 <w:tcPr>
-                  <w:tcW w:type="dxa" w:w="3422"/>
-                  <w:vAlign w:val="center"/>
-                  <w:shd w:fill="EAF2F8"/>
-                </w:tcPr>
-                <w:p>
-                  <w:pPr>
-                    <w:spacing w:after="40"/>
-                  </w:pPr>
-                  <w:r/>
-                  <w:r>
-                    <w:rPr>
-                      <w:b w:val="0"/>
-                      <w:sz w:val="16"/>
-                    </w:rPr>
+                  <w:tcW w:w="3422" w:type="dxa"/>
+                  <w:shd w:val="clear" w:color="auto" w:fill="EAF2F8"/>
+                  <w:vAlign w:val="center"/>
+                </w:tcPr>
+                <w:p>
+                  <w:pPr>
+                    <w:spacing w:after="40"/>
+                  </w:pPr>
+                  <w:r>
+                    <w:rPr>
+                      <w:sz w:val="16"/>
+                    </w:rPr>
+                    <w:lastRenderedPageBreak/>
                     <w:t>API San Camilo</w:t>
                   </w:r>
                 </w:p>
               </w:tc>
               <w:tc>
                 <w:tcPr>
-                  <w:tcW w:type="dxa" w:w="3422"/>
-                  <w:vAlign w:val="center"/>
-                  <w:shd w:fill="EAF2F8"/>
-                </w:tcPr>
-                <w:p>
-                  <w:pPr>
-                    <w:spacing w:after="40"/>
-                  </w:pPr>
-                  <w:r/>
-                  <w:r>
-                    <w:rPr>
-                      <w:b w:val="0"/>
+                  <w:tcW w:w="3422" w:type="dxa"/>
+                  <w:shd w:val="clear" w:color="auto" w:fill="EAF2F8"/>
+                  <w:vAlign w:val="center"/>
+                </w:tcPr>
+                <w:p>
+                  <w:pPr>
+                    <w:spacing w:after="40"/>
+                  </w:pPr>
+                  <w:r>
+                    <w:rPr>
                       <w:sz w:val="16"/>
                     </w:rPr>
                     <w:t>Python, FastAPI o Django, REST/JSON</w:t>
@@ -1328,18 +1352,16 @@
               </w:tc>
               <w:tc>
                 <w:tcPr>
-                  <w:tcW w:type="dxa" w:w="3422"/>
-                  <w:vAlign w:val="center"/>
-                  <w:shd w:fill="EAF2F8"/>
-                </w:tcPr>
-                <w:p>
-                  <w:pPr>
-                    <w:spacing w:after="40"/>
-                  </w:pPr>
-                  <w:r/>
-                  <w:r>
-                    <w:rPr>
-                      <w:b w:val="0"/>
+                  <w:tcW w:w="3422" w:type="dxa"/>
+                  <w:shd w:val="clear" w:color="auto" w:fill="EAF2F8"/>
+                  <w:vAlign w:val="center"/>
+                </w:tcPr>
+                <w:p>
+                  <w:pPr>
+                    <w:spacing w:after="40"/>
+                  </w:pPr>
+                  <w:r>
+                    <w:rPr>
                       <w:sz w:val="16"/>
                     </w:rPr>
                     <w:t>Monolito modular con los casos de uso y módulos de dominio.</w:t>
@@ -1350,17 +1372,15 @@
             <w:tr>
               <w:tc>
                 <w:tcPr>
-                  <w:tcW w:type="dxa" w:w="3422"/>
-                  <w:vAlign w:val="center"/>
-                </w:tcPr>
-                <w:p>
-                  <w:pPr>
-                    <w:spacing w:after="40"/>
-                  </w:pPr>
-                  <w:r/>
-                  <w:r>
-                    <w:rPr>
-                      <w:b w:val="0"/>
+                  <w:tcW w:w="3422" w:type="dxa"/>
+                  <w:vAlign w:val="center"/>
+                </w:tcPr>
+                <w:p>
+                  <w:pPr>
+                    <w:spacing w:after="40"/>
+                  </w:pPr>
+                  <w:r>
+                    <w:rPr>
                       <w:sz w:val="16"/>
                     </w:rPr>
                     <w:t>Worker de notificaciones</w:t>
@@ -1369,17 +1389,15 @@
               </w:tc>
               <w:tc>
                 <w:tcPr>
-                  <w:tcW w:type="dxa" w:w="3422"/>
-                  <w:vAlign w:val="center"/>
-                </w:tcPr>
-                <w:p>
-                  <w:pPr>
-                    <w:spacing w:after="40"/>
-                  </w:pPr>
-                  <w:r/>
-                  <w:r>
-                    <w:rPr>
-                      <w:b w:val="0"/>
+                  <w:tcW w:w="3422" w:type="dxa"/>
+                  <w:vAlign w:val="center"/>
+                </w:tcPr>
+                <w:p>
+                  <w:pPr>
+                    <w:spacing w:after="40"/>
+                  </w:pPr>
+                  <w:r>
+                    <w:rPr>
                       <w:sz w:val="16"/>
                     </w:rPr>
                     <w:t>Celery</w:t>
@@ -1388,17 +1406,15 @@
               </w:tc>
               <w:tc>
                 <w:tcPr>
-                  <w:tcW w:type="dxa" w:w="3422"/>
-                  <w:vAlign w:val="center"/>
-                </w:tcPr>
-                <w:p>
-                  <w:pPr>
-                    <w:spacing w:after="40"/>
-                  </w:pPr>
-                  <w:r/>
-                  <w:r>
-                    <w:rPr>
-                      <w:b w:val="0"/>
+                  <w:tcW w:w="3422" w:type="dxa"/>
+                  <w:vAlign w:val="center"/>
+                </w:tcPr>
+                <w:p>
+                  <w:pPr>
+                    <w:spacing w:after="40"/>
+                  </w:pPr>
+                  <w:r>
+                    <w:rPr>
                       <w:sz w:val="16"/>
                     </w:rPr>
                     <w:t>Consume avisos y aplica reintentos asíncronos.</w:t>
@@ -1409,18 +1425,16 @@
             <w:tr>
               <w:tc>
                 <w:tcPr>
-                  <w:tcW w:type="dxa" w:w="3422"/>
-                  <w:vAlign w:val="center"/>
-                  <w:shd w:fill="EAF2F8"/>
-                </w:tcPr>
-                <w:p>
-                  <w:pPr>
-                    <w:spacing w:after="40"/>
-                  </w:pPr>
-                  <w:r/>
-                  <w:r>
-                    <w:rPr>
-                      <w:b w:val="0"/>
+                  <w:tcW w:w="3422" w:type="dxa"/>
+                  <w:shd w:val="clear" w:color="auto" w:fill="EAF2F8"/>
+                  <w:vAlign w:val="center"/>
+                </w:tcPr>
+                <w:p>
+                  <w:pPr>
+                    <w:spacing w:after="40"/>
+                  </w:pPr>
+                  <w:r>
+                    <w:rPr>
                       <w:sz w:val="16"/>
                     </w:rPr>
                     <w:t>PostgreSQL</w:t>
@@ -1429,18 +1443,16 @@
               </w:tc>
               <w:tc>
                 <w:tcPr>
-                  <w:tcW w:type="dxa" w:w="3422"/>
-                  <w:vAlign w:val="center"/>
-                  <w:shd w:fill="EAF2F8"/>
-                </w:tcPr>
-                <w:p>
-                  <w:pPr>
-                    <w:spacing w:after="40"/>
-                  </w:pPr>
-                  <w:r/>
-                  <w:r>
-                    <w:rPr>
-                      <w:b w:val="0"/>
+                  <w:tcW w:w="3422" w:type="dxa"/>
+                  <w:shd w:val="clear" w:color="auto" w:fill="EAF2F8"/>
+                  <w:vAlign w:val="center"/>
+                </w:tcPr>
+                <w:p>
+                  <w:pPr>
+                    <w:spacing w:after="40"/>
+                  </w:pPr>
+                  <w:r>
+                    <w:rPr>
                       <w:sz w:val="16"/>
                     </w:rPr>
                     <w:t>PostgreSQL 15+, SQL/TCP</w:t>
@@ -1449,18 +1461,16 @@
               </w:tc>
               <w:tc>
                 <w:tcPr>
-                  <w:tcW w:type="dxa" w:w="3422"/>
-                  <w:vAlign w:val="center"/>
-                  <w:shd w:fill="EAF2F8"/>
-                </w:tcPr>
-                <w:p>
-                  <w:pPr>
-                    <w:spacing w:after="40"/>
-                  </w:pPr>
-                  <w:r/>
-                  <w:r>
-                    <w:rPr>
-                      <w:b w:val="0"/>
+                  <w:tcW w:w="3422" w:type="dxa"/>
+                  <w:shd w:val="clear" w:color="auto" w:fill="EAF2F8"/>
+                  <w:vAlign w:val="center"/>
+                </w:tcPr>
+                <w:p>
+                  <w:pPr>
+                    <w:spacing w:after="40"/>
+                  </w:pPr>
+                  <w:r>
+                    <w:rPr>
                       <w:sz w:val="16"/>
                     </w:rPr>
                     <w:t>Persistencia ACID con esquemas aislados por módulo.</w:t>
@@ -1471,17 +1481,15 @@
             <w:tr>
               <w:tc>
                 <w:tcPr>
-                  <w:tcW w:type="dxa" w:w="3422"/>
-                  <w:vAlign w:val="center"/>
-                </w:tcPr>
-                <w:p>
-                  <w:pPr>
-                    <w:spacing w:after="40"/>
-                  </w:pPr>
-                  <w:r/>
-                  <w:r>
-                    <w:rPr>
-                      <w:b w:val="0"/>
+                  <w:tcW w:w="3422" w:type="dxa"/>
+                  <w:vAlign w:val="center"/>
+                </w:tcPr>
+                <w:p>
+                  <w:pPr>
+                    <w:spacing w:after="40"/>
+                  </w:pPr>
+                  <w:r>
+                    <w:rPr>
                       <w:sz w:val="16"/>
                     </w:rPr>
                     <w:t>Redis</w:t>
@@ -1490,17 +1498,15 @@
               </w:tc>
               <w:tc>
                 <w:tcPr>
-                  <w:tcW w:type="dxa" w:w="3422"/>
-                  <w:vAlign w:val="center"/>
-                </w:tcPr>
-                <w:p>
-                  <w:pPr>
-                    <w:spacing w:after="40"/>
-                  </w:pPr>
-                  <w:r/>
-                  <w:r>
-                    <w:rPr>
-                      <w:b w:val="0"/>
+                  <w:tcW w:w="3422" w:type="dxa"/>
+                  <w:vAlign w:val="center"/>
+                </w:tcPr>
+                <w:p>
+                  <w:pPr>
+                    <w:spacing w:after="40"/>
+                  </w:pPr>
+                  <w:r>
+                    <w:rPr>
                       <w:sz w:val="16"/>
                     </w:rPr>
                     <w:t>Redis protocol</w:t>
@@ -1509,17 +1515,15 @@
               </w:tc>
               <w:tc>
                 <w:tcPr>
-                  <w:tcW w:type="dxa" w:w="3422"/>
-                  <w:vAlign w:val="center"/>
-                </w:tcPr>
-                <w:p>
-                  <w:pPr>
-                    <w:spacing w:after="40"/>
-                  </w:pPr>
-                  <w:r/>
-                  <w:r>
-                    <w:rPr>
-                      <w:b w:val="0"/>
+                  <w:tcW w:w="3422" w:type="dxa"/>
+                  <w:vAlign w:val="center"/>
+                </w:tcPr>
+                <w:p>
+                  <w:pPr>
+                    <w:spacing w:after="40"/>
+                  </w:pPr>
+                  <w:r>
+                    <w:rPr>
                       <w:sz w:val="16"/>
                     </w:rPr>
                     <w:t>Caché del catálogo y cola de notificaciones.</w:t>
@@ -1555,8 +1559,7 @@
           </w:p>
           <w:tbl>
             <w:tblPr>
-              <w:tblW w:type="auto" w:w="0"/>
-              <w:tblLook w:firstColumn="1" w:firstRow="1" w:lastColumn="0" w:lastRow="0" w:noHBand="0" w:noVBand="1" w:val="04A0"/>
+              <w:tblW w:w="0" w:type="auto"/>
               <w:tblBorders>
                 <w:top w:val="single" w:sz="4" w:space="0" w:color="D9D9D9"/>
                 <w:left w:val="single" w:sz="4" w:space="0" w:color="D9D9D9"/>
@@ -1565,6 +1568,7 @@
                 <w:insideH w:val="single" w:sz="4" w:space="0" w:color="D9D9D9"/>
                 <w:insideV w:val="single" w:sz="4" w:space="0" w:color="D9D9D9"/>
               </w:tblBorders>
+              <w:tblLook w:val="04A0" w:firstRow="1" w:lastRow="0" w:firstColumn="1" w:lastColumn="0" w:noHBand="0" w:noVBand="1"/>
             </w:tblPr>
             <w:tblGrid>
               <w:gridCol w:w="3422"/>
@@ -1574,15 +1578,14 @@
             <w:tr>
               <w:tc>
                 <w:tcPr>
-                  <w:tcW w:type="dxa" w:w="3422"/>
-                  <w:vAlign w:val="center"/>
-                  <w:shd w:fill="1F4E78"/>
-                </w:tcPr>
-                <w:p>
-                  <w:pPr>
-                    <w:spacing w:after="40"/>
-                  </w:pPr>
-                  <w:r/>
+                  <w:tcW w:w="3422" w:type="dxa"/>
+                  <w:shd w:val="clear" w:color="auto" w:fill="1F4E78"/>
+                  <w:vAlign w:val="center"/>
+                </w:tcPr>
+                <w:p>
+                  <w:pPr>
+                    <w:spacing w:after="40"/>
+                  </w:pPr>
                   <w:r>
                     <w:rPr>
                       <w:b/>
@@ -1595,15 +1598,14 @@
               </w:tc>
               <w:tc>
                 <w:tcPr>
-                  <w:tcW w:type="dxa" w:w="3422"/>
-                  <w:vAlign w:val="center"/>
-                  <w:shd w:fill="1F4E78"/>
-                </w:tcPr>
-                <w:p>
-                  <w:pPr>
-                    <w:spacing w:after="40"/>
-                  </w:pPr>
-                  <w:r/>
+                  <w:tcW w:w="3422" w:type="dxa"/>
+                  <w:shd w:val="clear" w:color="auto" w:fill="1F4E78"/>
+                  <w:vAlign w:val="center"/>
+                </w:tcPr>
+                <w:p>
+                  <w:pPr>
+                    <w:spacing w:after="40"/>
+                  </w:pPr>
                   <w:r>
                     <w:rPr>
                       <w:b/>
@@ -1616,15 +1618,14 @@
               </w:tc>
               <w:tc>
                 <w:tcPr>
-                  <w:tcW w:type="dxa" w:w="3422"/>
-                  <w:vAlign w:val="center"/>
-                  <w:shd w:fill="1F4E78"/>
-                </w:tcPr>
-                <w:p>
-                  <w:pPr>
-                    <w:spacing w:after="40"/>
-                  </w:pPr>
-                  <w:r/>
+                  <w:tcW w:w="3422" w:type="dxa"/>
+                  <w:shd w:val="clear" w:color="auto" w:fill="1F4E78"/>
+                  <w:vAlign w:val="center"/>
+                </w:tcPr>
+                <w:p>
+                  <w:pPr>
+                    <w:spacing w:after="40"/>
+                  </w:pPr>
                   <w:r>
                     <w:rPr>
                       <w:b/>
@@ -1639,17 +1640,15 @@
             <w:tr>
               <w:tc>
                 <w:tcPr>
-                  <w:tcW w:type="dxa" w:w="3422"/>
-                  <w:vAlign w:val="center"/>
-                </w:tcPr>
-                <w:p>
-                  <w:pPr>
-                    <w:spacing w:after="40"/>
-                  </w:pPr>
-                  <w:r/>
-                  <w:r>
-                    <w:rPr>
-                      <w:b w:val="0"/>
+                  <w:tcW w:w="3422" w:type="dxa"/>
+                  <w:vAlign w:val="center"/>
+                </w:tcPr>
+                <w:p>
+                  <w:pPr>
+                    <w:spacing w:after="40"/>
+                  </w:pPr>
+                  <w:r>
+                    <w:rPr>
                       <w:sz w:val="16"/>
                     </w:rPr>
                     <w:t>Catálogo</w:t>
@@ -1658,17 +1657,15 @@
               </w:tc>
               <w:tc>
                 <w:tcPr>
-                  <w:tcW w:type="dxa" w:w="3422"/>
-                  <w:vAlign w:val="center"/>
-                </w:tcPr>
-                <w:p>
-                  <w:pPr>
-                    <w:spacing w:after="40"/>
-                  </w:pPr>
-                  <w:r/>
-                  <w:r>
-                    <w:rPr>
-                      <w:b w:val="0"/>
+                  <w:tcW w:w="3422" w:type="dxa"/>
+                  <w:vAlign w:val="center"/>
+                </w:tcPr>
+                <w:p>
+                  <w:pPr>
+                    <w:spacing w:after="40"/>
+                  </w:pPr>
+                  <w:r>
+                    <w:rPr>
                       <w:sz w:val="16"/>
                     </w:rPr>
                     <w:t>Puestos, productos, precios, disponibilidad y reserva de stock.</w:t>
@@ -1677,17 +1674,15 @@
               </w:tc>
               <w:tc>
                 <w:tcPr>
-                  <w:tcW w:type="dxa" w:w="3422"/>
-                  <w:vAlign w:val="center"/>
-                </w:tcPr>
-                <w:p>
-                  <w:pPr>
-                    <w:spacing w:after="40"/>
-                  </w:pPr>
-                  <w:r/>
-                  <w:r>
-                    <w:rPr>
-                      <w:b w:val="0"/>
+                  <w:tcW w:w="3422" w:type="dxa"/>
+                  <w:vAlign w:val="center"/>
+                </w:tcPr>
+                <w:p>
+                  <w:pPr>
+                    <w:spacing w:after="40"/>
+                  </w:pPr>
+                  <w:r>
+                    <w:rPr>
                       <w:sz w:val="16"/>
                     </w:rPr>
                     <w:t>PostgreSQL, Redis</w:t>
@@ -1698,18 +1693,16 @@
             <w:tr>
               <w:tc>
                 <w:tcPr>
-                  <w:tcW w:type="dxa" w:w="3422"/>
-                  <w:vAlign w:val="center"/>
-                  <w:shd w:fill="EAF2F8"/>
-                </w:tcPr>
-                <w:p>
-                  <w:pPr>
-                    <w:spacing w:after="40"/>
-                  </w:pPr>
-                  <w:r/>
-                  <w:r>
-                    <w:rPr>
-                      <w:b w:val="0"/>
+                  <w:tcW w:w="3422" w:type="dxa"/>
+                  <w:shd w:val="clear" w:color="auto" w:fill="EAF2F8"/>
+                  <w:vAlign w:val="center"/>
+                </w:tcPr>
+                <w:p>
+                  <w:pPr>
+                    <w:spacing w:after="40"/>
+                  </w:pPr>
+                  <w:r>
+                    <w:rPr>
                       <w:sz w:val="16"/>
                     </w:rPr>
                     <w:t>Pedidos</w:t>
@@ -1718,18 +1711,16 @@
               </w:tc>
               <w:tc>
                 <w:tcPr>
-                  <w:tcW w:type="dxa" w:w="3422"/>
-                  <w:vAlign w:val="center"/>
-                  <w:shd w:fill="EAF2F8"/>
-                </w:tcPr>
-                <w:p>
-                  <w:pPr>
-                    <w:spacing w:after="40"/>
-                  </w:pPr>
-                  <w:r/>
-                  <w:r>
-                    <w:rPr>
-                      <w:b w:val="0"/>
+                  <w:tcW w:w="3422" w:type="dxa"/>
+                  <w:shd w:val="clear" w:color="auto" w:fill="EAF2F8"/>
+                  <w:vAlign w:val="center"/>
+                </w:tcPr>
+                <w:p>
+                  <w:pPr>
+                    <w:spacing w:after="40"/>
+                  </w:pPr>
+                  <w:r>
+                    <w:rPr>
                       <w:sz w:val="16"/>
                     </w:rPr>
                     <w:t>Carrito multi-puesto, subórdenes y estados.</w:t>
@@ -1738,18 +1729,16 @@
               </w:tc>
               <w:tc>
                 <w:tcPr>
-                  <w:tcW w:type="dxa" w:w="3422"/>
-                  <w:vAlign w:val="center"/>
-                  <w:shd w:fill="EAF2F8"/>
-                </w:tcPr>
-                <w:p>
-                  <w:pPr>
-                    <w:spacing w:after="40"/>
-                  </w:pPr>
-                  <w:r/>
-                  <w:r>
-                    <w:rPr>
-                      <w:b w:val="0"/>
+                  <w:tcW w:w="3422" w:type="dxa"/>
+                  <w:shd w:val="clear" w:color="auto" w:fill="EAF2F8"/>
+                  <w:vAlign w:val="center"/>
+                </w:tcPr>
+                <w:p>
+                  <w:pPr>
+                    <w:spacing w:after="40"/>
+                  </w:pPr>
+                  <w:r>
+                    <w:rPr>
                       <w:sz w:val="16"/>
                     </w:rPr>
                     <w:t>Catálogo, Pagos, Notificaciones, Usuarios</w:t>
@@ -1760,17 +1749,15 @@
             <w:tr>
               <w:tc>
                 <w:tcPr>
-                  <w:tcW w:type="dxa" w:w="3422"/>
-                  <w:vAlign w:val="center"/>
-                </w:tcPr>
-                <w:p>
-                  <w:pPr>
-                    <w:spacing w:after="40"/>
-                  </w:pPr>
-                  <w:r/>
-                  <w:r>
-                    <w:rPr>
-                      <w:b w:val="0"/>
+                  <w:tcW w:w="3422" w:type="dxa"/>
+                  <w:vAlign w:val="center"/>
+                </w:tcPr>
+                <w:p>
+                  <w:pPr>
+                    <w:spacing w:after="40"/>
+                  </w:pPr>
+                  <w:r>
+                    <w:rPr>
                       <w:sz w:val="16"/>
                     </w:rPr>
                     <w:t>Pagos</w:t>
@@ -1779,17 +1766,15 @@
               </w:tc>
               <w:tc>
                 <w:tcPr>
-                  <w:tcW w:type="dxa" w:w="3422"/>
-                  <w:vAlign w:val="center"/>
-                </w:tcPr>
-                <w:p>
-                  <w:pPr>
-                    <w:spacing w:after="40"/>
-                  </w:pPr>
-                  <w:r/>
-                  <w:r>
-                    <w:rPr>
-                      <w:b w:val="0"/>
+                  <w:tcW w:w="3422" w:type="dxa"/>
+                  <w:vAlign w:val="center"/>
+                </w:tcPr>
+                <w:p>
+                  <w:pPr>
+                    <w:spacing w:after="40"/>
+                  </w:pPr>
+                  <w:r>
+                    <w:rPr>
                       <w:sz w:val="16"/>
                     </w:rPr>
                     <w:t>Registro y validación desacoplada del comprobante.</w:t>
@@ -1798,17 +1783,15 @@
               </w:tc>
               <w:tc>
                 <w:tcPr>
-                  <w:tcW w:type="dxa" w:w="3422"/>
-                  <w:vAlign w:val="center"/>
-                </w:tcPr>
-                <w:p>
-                  <w:pPr>
-                    <w:spacing w:after="40"/>
-                  </w:pPr>
-                  <w:r/>
-                  <w:r>
-                    <w:rPr>
-                      <w:b w:val="0"/>
+                  <w:tcW w:w="3422" w:type="dxa"/>
+                  <w:vAlign w:val="center"/>
+                </w:tcPr>
+                <w:p>
+                  <w:pPr>
+                    <w:spacing w:after="40"/>
+                  </w:pPr>
+                  <w:r>
+                    <w:rPr>
                       <w:sz w:val="16"/>
                     </w:rPr>
                     <w:t>PostgreSQL; puerto de pasarela</w:t>
@@ -1819,18 +1802,16 @@
             <w:tr>
               <w:tc>
                 <w:tcPr>
-                  <w:tcW w:type="dxa" w:w="3422"/>
-                  <w:vAlign w:val="center"/>
-                  <w:shd w:fill="EAF2F8"/>
-                </w:tcPr>
-                <w:p>
-                  <w:pPr>
-                    <w:spacing w:after="40"/>
-                  </w:pPr>
-                  <w:r/>
-                  <w:r>
-                    <w:rPr>
-                      <w:b w:val="0"/>
+                  <w:tcW w:w="3422" w:type="dxa"/>
+                  <w:shd w:val="clear" w:color="auto" w:fill="EAF2F8"/>
+                  <w:vAlign w:val="center"/>
+                </w:tcPr>
+                <w:p>
+                  <w:pPr>
+                    <w:spacing w:after="40"/>
+                  </w:pPr>
+                  <w:r>
+                    <w:rPr>
                       <w:sz w:val="16"/>
                     </w:rPr>
                     <w:t>Notificaciones</w:t>
@@ -1839,18 +1820,16 @@
               </w:tc>
               <w:tc>
                 <w:tcPr>
-                  <w:tcW w:type="dxa" w:w="3422"/>
-                  <w:vAlign w:val="center"/>
-                  <w:shd w:fill="EAF2F8"/>
-                </w:tcPr>
-                <w:p>
-                  <w:pPr>
-                    <w:spacing w:after="40"/>
-                  </w:pPr>
-                  <w:r/>
-                  <w:r>
-                    <w:rPr>
-                      <w:b w:val="0"/>
+                  <w:tcW w:w="3422" w:type="dxa"/>
+                  <w:shd w:val="clear" w:color="auto" w:fill="EAF2F8"/>
+                  <w:vAlign w:val="center"/>
+                </w:tcPr>
+                <w:p>
+                  <w:pPr>
+                    <w:spacing w:after="40"/>
+                  </w:pPr>
+                  <w:r>
+                    <w:rPr>
                       <w:sz w:val="16"/>
                     </w:rPr>
                     <w:t>Formato y encolado de avisos por puesto.</w:t>
@@ -1859,18 +1838,16 @@
               </w:tc>
               <w:tc>
                 <w:tcPr>
-                  <w:tcW w:type="dxa" w:w="3422"/>
-                  <w:vAlign w:val="center"/>
-                  <w:shd w:fill="EAF2F8"/>
-                </w:tcPr>
-                <w:p>
-                  <w:pPr>
-                    <w:spacing w:after="40"/>
-                  </w:pPr>
-                  <w:r/>
-                  <w:r>
-                    <w:rPr>
-                      <w:b w:val="0"/>
+                  <w:tcW w:w="3422" w:type="dxa"/>
+                  <w:shd w:val="clear" w:color="auto" w:fill="EAF2F8"/>
+                  <w:vAlign w:val="center"/>
+                </w:tcPr>
+                <w:p>
+                  <w:pPr>
+                    <w:spacing w:after="40"/>
+                  </w:pPr>
+                  <w:r>
+                    <w:rPr>
                       <w:sz w:val="16"/>
                     </w:rPr>
                     <w:t>PostgreSQL, Redis; puerto WhatsApp</w:t>
@@ -1881,17 +1858,15 @@
             <w:tr>
               <w:tc>
                 <w:tcPr>
-                  <w:tcW w:type="dxa" w:w="3422"/>
-                  <w:vAlign w:val="center"/>
-                </w:tcPr>
-                <w:p>
-                  <w:pPr>
-                    <w:spacing w:after="40"/>
-                  </w:pPr>
-                  <w:r/>
-                  <w:r>
-                    <w:rPr>
-                      <w:b w:val="0"/>
+                  <w:tcW w:w="3422" w:type="dxa"/>
+                  <w:vAlign w:val="center"/>
+                </w:tcPr>
+                <w:p>
+                  <w:pPr>
+                    <w:spacing w:after="40"/>
+                  </w:pPr>
+                  <w:r>
+                    <w:rPr>
                       <w:sz w:val="16"/>
                     </w:rPr>
                     <w:t>Usuarios</w:t>
@@ -1900,17 +1875,15 @@
               </w:tc>
               <w:tc>
                 <w:tcPr>
-                  <w:tcW w:type="dxa" w:w="3422"/>
-                  <w:vAlign w:val="center"/>
-                </w:tcPr>
-                <w:p>
-                  <w:pPr>
-                    <w:spacing w:after="40"/>
-                  </w:pPr>
-                  <w:r/>
-                  <w:r>
-                    <w:rPr>
-                      <w:b w:val="0"/>
+                  <w:tcW w:w="3422" w:type="dxa"/>
+                  <w:vAlign w:val="center"/>
+                </w:tcPr>
+                <w:p>
+                  <w:pPr>
+                    <w:spacing w:after="40"/>
+                  </w:pPr>
+                  <w:r>
+                    <w:rPr>
                       <w:sz w:val="16"/>
                     </w:rPr>
                     <w:t>Autenticación y perfiles de los cuatro roles.</w:t>
@@ -1919,17 +1892,15 @@
               </w:tc>
               <w:tc>
                 <w:tcPr>
-                  <w:tcW w:type="dxa" w:w="3422"/>
-                  <w:vAlign w:val="center"/>
-                </w:tcPr>
-                <w:p>
-                  <w:pPr>
-                    <w:spacing w:after="40"/>
-                  </w:pPr>
-                  <w:r/>
-                  <w:r>
-                    <w:rPr>
-                      <w:b w:val="0"/>
+                  <w:tcW w:w="3422" w:type="dxa"/>
+                  <w:vAlign w:val="center"/>
+                </w:tcPr>
+                <w:p>
+                  <w:pPr>
+                    <w:spacing w:after="40"/>
+                  </w:pPr>
+                  <w:r>
+                    <w:rPr>
                       <w:sz w:val="16"/>
                     </w:rPr>
                     <w:t>PostgreSQL</w:t>
@@ -1965,8 +1936,7 @@
           </w:p>
           <w:tbl>
             <w:tblPr>
-              <w:tblW w:type="auto" w:w="0"/>
-              <w:tblLook w:firstColumn="1" w:firstRow="1" w:lastColumn="0" w:lastRow="0" w:noHBand="0" w:noVBand="1" w:val="04A0"/>
+              <w:tblW w:w="0" w:type="auto"/>
               <w:tblBorders>
                 <w:top w:val="single" w:sz="4" w:space="0" w:color="D9D9D9"/>
                 <w:left w:val="single" w:sz="4" w:space="0" w:color="D9D9D9"/>
@@ -1975,6 +1945,7 @@
                 <w:insideH w:val="single" w:sz="4" w:space="0" w:color="D9D9D9"/>
                 <w:insideV w:val="single" w:sz="4" w:space="0" w:color="D9D9D9"/>
               </w:tblBorders>
+              <w:tblLook w:val="04A0" w:firstRow="1" w:lastRow="0" w:firstColumn="1" w:lastColumn="0" w:noHBand="0" w:noVBand="1"/>
             </w:tblPr>
             <w:tblGrid>
               <w:gridCol w:w="3422"/>
@@ -1984,15 +1955,14 @@
             <w:tr>
               <w:tc>
                 <w:tcPr>
-                  <w:tcW w:type="dxa" w:w="3422"/>
-                  <w:vAlign w:val="center"/>
-                  <w:shd w:fill="1F4E78"/>
-                </w:tcPr>
-                <w:p>
-                  <w:pPr>
-                    <w:spacing w:after="40"/>
-                  </w:pPr>
-                  <w:r/>
+                  <w:tcW w:w="3422" w:type="dxa"/>
+                  <w:shd w:val="clear" w:color="auto" w:fill="1F4E78"/>
+                  <w:vAlign w:val="center"/>
+                </w:tcPr>
+                <w:p>
+                  <w:pPr>
+                    <w:spacing w:after="40"/>
+                  </w:pPr>
                   <w:r>
                     <w:rPr>
                       <w:b/>
@@ -2005,15 +1975,14 @@
               </w:tc>
               <w:tc>
                 <w:tcPr>
-                  <w:tcW w:type="dxa" w:w="3422"/>
-                  <w:vAlign w:val="center"/>
-                  <w:shd w:fill="1F4E78"/>
-                </w:tcPr>
-                <w:p>
-                  <w:pPr>
-                    <w:spacing w:after="40"/>
-                  </w:pPr>
-                  <w:r/>
+                  <w:tcW w:w="3422" w:type="dxa"/>
+                  <w:shd w:val="clear" w:color="auto" w:fill="1F4E78"/>
+                  <w:vAlign w:val="center"/>
+                </w:tcPr>
+                <w:p>
+                  <w:pPr>
+                    <w:spacing w:after="40"/>
+                  </w:pPr>
                   <w:r>
                     <w:rPr>
                       <w:b/>
@@ -2026,15 +1995,14 @@
               </w:tc>
               <w:tc>
                 <w:tcPr>
-                  <w:tcW w:type="dxa" w:w="3422"/>
-                  <w:vAlign w:val="center"/>
-                  <w:shd w:fill="1F4E78"/>
-                </w:tcPr>
-                <w:p>
-                  <w:pPr>
-                    <w:spacing w:after="40"/>
-                  </w:pPr>
-                  <w:r/>
+                  <w:tcW w:w="3422" w:type="dxa"/>
+                  <w:shd w:val="clear" w:color="auto" w:fill="1F4E78"/>
+                  <w:vAlign w:val="center"/>
+                </w:tcPr>
+                <w:p>
+                  <w:pPr>
+                    <w:spacing w:after="40"/>
+                  </w:pPr>
                   <w:r>
                     <w:rPr>
                       <w:b/>
@@ -2049,17 +2017,15 @@
             <w:tr>
               <w:tc>
                 <w:tcPr>
-                  <w:tcW w:type="dxa" w:w="3422"/>
-                  <w:vAlign w:val="center"/>
-                </w:tcPr>
-                <w:p>
-                  <w:pPr>
-                    <w:spacing w:after="40"/>
-                  </w:pPr>
-                  <w:r/>
-                  <w:r>
-                    <w:rPr>
-                      <w:b w:val="0"/>
+                  <w:tcW w:w="3422" w:type="dxa"/>
+                  <w:vAlign w:val="center"/>
+                </w:tcPr>
+                <w:p>
+                  <w:pPr>
+                    <w:spacing w:after="40"/>
+                  </w:pPr>
+                  <w:r>
+                    <w:rPr>
                       <w:sz w:val="16"/>
                     </w:rPr>
                     <w:t>1</w:t>
@@ -2068,17 +2034,15 @@
               </w:tc>
               <w:tc>
                 <w:tcPr>
-                  <w:tcW w:type="dxa" w:w="3422"/>
-                  <w:vAlign w:val="center"/>
-                </w:tcPr>
-                <w:p>
-                  <w:pPr>
-                    <w:spacing w:after="40"/>
-                  </w:pPr>
-                  <w:r/>
-                  <w:r>
-                    <w:rPr>
-                      <w:b w:val="0"/>
+                  <w:tcW w:w="3422" w:type="dxa"/>
+                  <w:vAlign w:val="center"/>
+                </w:tcPr>
+                <w:p>
+                  <w:pPr>
+                    <w:spacing w:after="40"/>
+                  </w:pPr>
+                  <w:r>
+                    <w:rPr>
                       <w:sz w:val="16"/>
                     </w:rPr>
                     <w:t>PWA envía pedido, modalidad, código y comprobante a Pedidos.</w:t>
@@ -2087,17 +2051,15 @@
               </w:tc>
               <w:tc>
                 <w:tcPr>
-                  <w:tcW w:type="dxa" w:w="3422"/>
-                  <w:vAlign w:val="center"/>
-                </w:tcPr>
-                <w:p>
-                  <w:pPr>
-                    <w:spacing w:after="40"/>
-                  </w:pPr>
-                  <w:r/>
-                  <w:r>
-                    <w:rPr>
-                      <w:b w:val="0"/>
+                  <w:tcW w:w="3422" w:type="dxa"/>
+                  <w:vAlign w:val="center"/>
+                </w:tcPr>
+                <w:p>
+                  <w:pPr>
+                    <w:spacing w:after="40"/>
+                  </w:pPr>
+                  <w:r>
+                    <w:rPr>
                       <w:sz w:val="16"/>
                     </w:rPr>
                     <w:t>HTTPS/JSON</w:t>
@@ -2108,18 +2070,16 @@
             <w:tr>
               <w:tc>
                 <w:tcPr>
-                  <w:tcW w:type="dxa" w:w="3422"/>
-                  <w:vAlign w:val="center"/>
-                  <w:shd w:fill="EAF2F8"/>
-                </w:tcPr>
-                <w:p>
-                  <w:pPr>
-                    <w:spacing w:after="40"/>
-                  </w:pPr>
-                  <w:r/>
-                  <w:r>
-                    <w:rPr>
-                      <w:b w:val="0"/>
+                  <w:tcW w:w="3422" w:type="dxa"/>
+                  <w:shd w:val="clear" w:color="auto" w:fill="EAF2F8"/>
+                  <w:vAlign w:val="center"/>
+                </w:tcPr>
+                <w:p>
+                  <w:pPr>
+                    <w:spacing w:after="40"/>
+                  </w:pPr>
+                  <w:r>
+                    <w:rPr>
                       <w:sz w:val="16"/>
                     </w:rPr>
                     <w:t>2</w:t>
@@ -2128,18 +2088,16 @@
               </w:tc>
               <w:tc>
                 <w:tcPr>
-                  <w:tcW w:type="dxa" w:w="3422"/>
-                  <w:vAlign w:val="center"/>
-                  <w:shd w:fill="EAF2F8"/>
-                </w:tcPr>
-                <w:p>
-                  <w:pPr>
-                    <w:spacing w:after="40"/>
-                  </w:pPr>
-                  <w:r/>
-                  <w:r>
-                    <w:rPr>
-                      <w:b w:val="0"/>
+                  <w:tcW w:w="3422" w:type="dxa"/>
+                  <w:shd w:val="clear" w:color="auto" w:fill="EAF2F8"/>
+                  <w:vAlign w:val="center"/>
+                </w:tcPr>
+                <w:p>
+                  <w:pPr>
+                    <w:spacing w:after="40"/>
+                  </w:pPr>
+                  <w:r>
+                    <w:rPr>
                       <w:sz w:val="16"/>
                     </w:rPr>
                     <w:t>Pedidos solicita a Catálogo reservar stock.</w:t>
@@ -2148,18 +2106,16 @@
               </w:tc>
               <w:tc>
                 <w:tcPr>
-                  <w:tcW w:type="dxa" w:w="3422"/>
-                  <w:vAlign w:val="center"/>
-                  <w:shd w:fill="EAF2F8"/>
-                </w:tcPr>
-                <w:p>
-                  <w:pPr>
-                    <w:spacing w:after="40"/>
-                  </w:pPr>
-                  <w:r/>
-                  <w:r>
-                    <w:rPr>
-                      <w:b w:val="0"/>
+                  <w:tcW w:w="3422" w:type="dxa"/>
+                  <w:shd w:val="clear" w:color="auto" w:fill="EAF2F8"/>
+                  <w:vAlign w:val="center"/>
+                </w:tcPr>
+                <w:p>
+                  <w:pPr>
+                    <w:spacing w:after="40"/>
+                  </w:pPr>
+                  <w:r>
+                    <w:rPr>
                       <w:sz w:val="16"/>
                     </w:rPr>
                     <w:t>Interfaz en memoria</w:t>
@@ -2170,17 +2126,15 @@
             <w:tr>
               <w:tc>
                 <w:tcPr>
-                  <w:tcW w:type="dxa" w:w="3422"/>
-                  <w:vAlign w:val="center"/>
-                </w:tcPr>
-                <w:p>
-                  <w:pPr>
-                    <w:spacing w:after="40"/>
-                  </w:pPr>
-                  <w:r/>
-                  <w:r>
-                    <w:rPr>
-                      <w:b w:val="0"/>
+                  <w:tcW w:w="3422" w:type="dxa"/>
+                  <w:vAlign w:val="center"/>
+                </w:tcPr>
+                <w:p>
+                  <w:pPr>
+                    <w:spacing w:after="40"/>
+                  </w:pPr>
+                  <w:r>
+                    <w:rPr>
                       <w:sz w:val="16"/>
                     </w:rPr>
                     <w:t>3</w:t>
@@ -2189,17 +2143,15 @@
               </w:tc>
               <w:tc>
                 <w:tcPr>
-                  <w:tcW w:type="dxa" w:w="3422"/>
-                  <w:vAlign w:val="center"/>
-                </w:tcPr>
-                <w:p>
-                  <w:pPr>
-                    <w:spacing w:after="40"/>
-                  </w:pPr>
-                  <w:r/>
-                  <w:r>
-                    <w:rPr>
-                      <w:b w:val="0"/>
+                  <w:tcW w:w="3422" w:type="dxa"/>
+                  <w:vAlign w:val="center"/>
+                </w:tcPr>
+                <w:p>
+                  <w:pPr>
+                    <w:spacing w:after="40"/>
+                  </w:pPr>
+                  <w:r>
+                    <w:rPr>
                       <w:sz w:val="16"/>
                     </w:rPr>
                     <w:t>Pedidos solicita a Pagos registrar y validar el comprobante.</w:t>
@@ -2208,17 +2160,15 @@
               </w:tc>
               <w:tc>
                 <w:tcPr>
-                  <w:tcW w:type="dxa" w:w="3422"/>
-                  <w:vAlign w:val="center"/>
-                </w:tcPr>
-                <w:p>
-                  <w:pPr>
-                    <w:spacing w:after="40"/>
-                  </w:pPr>
-                  <w:r/>
-                  <w:r>
-                    <w:rPr>
-                      <w:b w:val="0"/>
+                  <w:tcW w:w="3422" w:type="dxa"/>
+                  <w:vAlign w:val="center"/>
+                </w:tcPr>
+                <w:p>
+                  <w:pPr>
+                    <w:spacing w:after="40"/>
+                  </w:pPr>
+                  <w:r>
+                    <w:rPr>
                       <w:sz w:val="16"/>
                     </w:rPr>
                     <w:t>Interfaz en memoria</w:t>
@@ -2229,18 +2179,16 @@
             <w:tr>
               <w:tc>
                 <w:tcPr>
-                  <w:tcW w:type="dxa" w:w="3422"/>
-                  <w:vAlign w:val="center"/>
-                  <w:shd w:fill="EAF2F8"/>
-                </w:tcPr>
-                <w:p>
-                  <w:pPr>
-                    <w:spacing w:after="40"/>
-                  </w:pPr>
-                  <w:r/>
-                  <w:r>
-                    <w:rPr>
-                      <w:b w:val="0"/>
+                  <w:tcW w:w="3422" w:type="dxa"/>
+                  <w:shd w:val="clear" w:color="auto" w:fill="EAF2F8"/>
+                  <w:vAlign w:val="center"/>
+                </w:tcPr>
+                <w:p>
+                  <w:pPr>
+                    <w:spacing w:after="40"/>
+                  </w:pPr>
+                  <w:r>
+                    <w:rPr>
                       <w:sz w:val="16"/>
                     </w:rPr>
                     <w:t>4</w:t>
@@ -2249,18 +2197,16 @@
               </w:tc>
               <w:tc>
                 <w:tcPr>
-                  <w:tcW w:type="dxa" w:w="3422"/>
-                  <w:vAlign w:val="center"/>
-                  <w:shd w:fill="EAF2F8"/>
-                </w:tcPr>
-                <w:p>
-                  <w:pPr>
-                    <w:spacing w:after="40"/>
-                  </w:pPr>
-                  <w:r/>
-                  <w:r>
-                    <w:rPr>
-                      <w:b w:val="0"/>
+                  <w:tcW w:w="3422" w:type="dxa"/>
+                  <w:shd w:val="clear" w:color="auto" w:fill="EAF2F8"/>
+                  <w:vAlign w:val="center"/>
+                </w:tcPr>
+                <w:p>
+                  <w:pPr>
+                    <w:spacing w:after="40"/>
+                  </w:pPr>
+                  <w:r>
+                    <w:rPr>
                       <w:sz w:val="16"/>
                     </w:rPr>
                     <w:t>Pagos persiste estado del pago.</w:t>
@@ -2269,18 +2215,16 @@
               </w:tc>
               <w:tc>
                 <w:tcPr>
-                  <w:tcW w:type="dxa" w:w="3422"/>
-                  <w:vAlign w:val="center"/>
-                  <w:shd w:fill="EAF2F8"/>
-                </w:tcPr>
-                <w:p>
-                  <w:pPr>
-                    <w:spacing w:after="40"/>
-                  </w:pPr>
-                  <w:r/>
-                  <w:r>
-                    <w:rPr>
-                      <w:b w:val="0"/>
+                  <w:tcW w:w="3422" w:type="dxa"/>
+                  <w:shd w:val="clear" w:color="auto" w:fill="EAF2F8"/>
+                  <w:vAlign w:val="center"/>
+                </w:tcPr>
+                <w:p>
+                  <w:pPr>
+                    <w:spacing w:after="40"/>
+                  </w:pPr>
+                  <w:r>
+                    <w:rPr>
                       <w:sz w:val="16"/>
                     </w:rPr>
                     <w:t>SQL/TCP</w:t>
@@ -2291,17 +2235,15 @@
             <w:tr>
               <w:tc>
                 <w:tcPr>
-                  <w:tcW w:type="dxa" w:w="3422"/>
-                  <w:vAlign w:val="center"/>
-                </w:tcPr>
-                <w:p>
-                  <w:pPr>
-                    <w:spacing w:after="40"/>
-                  </w:pPr>
-                  <w:r/>
-                  <w:r>
-                    <w:rPr>
-                      <w:b w:val="0"/>
+                  <w:tcW w:w="3422" w:type="dxa"/>
+                  <w:vAlign w:val="center"/>
+                </w:tcPr>
+                <w:p>
+                  <w:pPr>
+                    <w:spacing w:after="40"/>
+                  </w:pPr>
+                  <w:r>
+                    <w:rPr>
                       <w:sz w:val="16"/>
                     </w:rPr>
                     <w:t>5</w:t>
@@ -2310,17 +2252,15 @@
               </w:tc>
               <w:tc>
                 <w:tcPr>
-                  <w:tcW w:type="dxa" w:w="3422"/>
-                  <w:vAlign w:val="center"/>
-                </w:tcPr>
-                <w:p>
-                  <w:pPr>
-                    <w:spacing w:after="40"/>
-                  </w:pPr>
-                  <w:r/>
-                  <w:r>
-                    <w:rPr>
-                      <w:b w:val="0"/>
+                  <w:tcW w:w="3422" w:type="dxa"/>
+                  <w:vAlign w:val="center"/>
+                </w:tcPr>
+                <w:p>
+                  <w:pPr>
+                    <w:spacing w:after="40"/>
+                  </w:pPr>
+                  <w:r>
+                    <w:rPr>
                       <w:sz w:val="16"/>
                     </w:rPr>
                     <w:t>Pedidos guarda pedido y subórdenes de forma atómica.</w:t>
@@ -2329,17 +2269,15 @@
               </w:tc>
               <w:tc>
                 <w:tcPr>
-                  <w:tcW w:type="dxa" w:w="3422"/>
-                  <w:vAlign w:val="center"/>
-                </w:tcPr>
-                <w:p>
-                  <w:pPr>
-                    <w:spacing w:after="40"/>
-                  </w:pPr>
-                  <w:r/>
-                  <w:r>
-                    <w:rPr>
-                      <w:b w:val="0"/>
+                  <w:tcW w:w="3422" w:type="dxa"/>
+                  <w:vAlign w:val="center"/>
+                </w:tcPr>
+                <w:p>
+                  <w:pPr>
+                    <w:spacing w:after="40"/>
+                  </w:pPr>
+                  <w:r>
+                    <w:rPr>
                       <w:sz w:val="16"/>
                     </w:rPr>
                     <w:t>SQL/TCP</w:t>
@@ -2350,18 +2288,16 @@
             <w:tr>
               <w:tc>
                 <w:tcPr>
-                  <w:tcW w:type="dxa" w:w="3422"/>
-                  <w:vAlign w:val="center"/>
-                  <w:shd w:fill="EAF2F8"/>
-                </w:tcPr>
-                <w:p>
-                  <w:pPr>
-                    <w:spacing w:after="40"/>
-                  </w:pPr>
-                  <w:r/>
-                  <w:r>
-                    <w:rPr>
-                      <w:b w:val="0"/>
+                  <w:tcW w:w="3422" w:type="dxa"/>
+                  <w:shd w:val="clear" w:color="auto" w:fill="EAF2F8"/>
+                  <w:vAlign w:val="center"/>
+                </w:tcPr>
+                <w:p>
+                  <w:pPr>
+                    <w:spacing w:after="40"/>
+                  </w:pPr>
+                  <w:r>
+                    <w:rPr>
                       <w:sz w:val="16"/>
                     </w:rPr>
                     <w:t>6-7</w:t>
@@ -2370,18 +2306,16 @@
               </w:tc>
               <w:tc>
                 <w:tcPr>
-                  <w:tcW w:type="dxa" w:w="3422"/>
-                  <w:vAlign w:val="center"/>
-                  <w:shd w:fill="EAF2F8"/>
-                </w:tcPr>
-                <w:p>
-                  <w:pPr>
-                    <w:spacing w:after="40"/>
-                  </w:pPr>
-                  <w:r/>
-                  <w:r>
-                    <w:rPr>
-                      <w:b w:val="0"/>
+                  <w:tcW w:w="3422" w:type="dxa"/>
+                  <w:shd w:val="clear" w:color="auto" w:fill="EAF2F8"/>
+                  <w:vAlign w:val="center"/>
+                </w:tcPr>
+                <w:p>
+                  <w:pPr>
+                    <w:spacing w:after="40"/>
+                  </w:pPr>
+                  <w:r>
+                    <w:rPr>
                       <w:sz w:val="16"/>
                     </w:rPr>
                     <w:t>Notificaciones encola avisos y reintentos.</w:t>
@@ -2390,18 +2324,16 @@
               </w:tc>
               <w:tc>
                 <w:tcPr>
-                  <w:tcW w:type="dxa" w:w="3422"/>
-                  <w:vAlign w:val="center"/>
-                  <w:shd w:fill="EAF2F8"/>
-                </w:tcPr>
-                <w:p>
-                  <w:pPr>
-                    <w:spacing w:after="40"/>
-                  </w:pPr>
-                  <w:r/>
-                  <w:r>
-                    <w:rPr>
-                      <w:b w:val="0"/>
+                  <w:tcW w:w="3422" w:type="dxa"/>
+                  <w:shd w:val="clear" w:color="auto" w:fill="EAF2F8"/>
+                  <w:vAlign w:val="center"/>
+                </w:tcPr>
+                <w:p>
+                  <w:pPr>
+                    <w:spacing w:after="40"/>
+                  </w:pPr>
+                  <w:r>
+                    <w:rPr>
                       <w:sz w:val="16"/>
                     </w:rPr>
                     <w:t>Redis protocol</w:t>
@@ -2412,17 +2344,15 @@
             <w:tr>
               <w:tc>
                 <w:tcPr>
-                  <w:tcW w:type="dxa" w:w="3422"/>
-                  <w:vAlign w:val="center"/>
-                </w:tcPr>
-                <w:p>
-                  <w:pPr>
-                    <w:spacing w:after="40"/>
-                  </w:pPr>
-                  <w:r/>
-                  <w:r>
-                    <w:rPr>
-                      <w:b w:val="0"/>
+                  <w:tcW w:w="3422" w:type="dxa"/>
+                  <w:vAlign w:val="center"/>
+                </w:tcPr>
+                <w:p>
+                  <w:pPr>
+                    <w:spacing w:after="40"/>
+                  </w:pPr>
+                  <w:r>
+                    <w:rPr>
                       <w:sz w:val="16"/>
                     </w:rPr>
                     <w:t>8-9</w:t>
@@ -2431,17 +2361,15 @@
               </w:tc>
               <w:tc>
                 <w:tcPr>
-                  <w:tcW w:type="dxa" w:w="3422"/>
-                  <w:vAlign w:val="center"/>
-                </w:tcPr>
-                <w:p>
-                  <w:pPr>
-                    <w:spacing w:after="40"/>
-                  </w:pPr>
-                  <w:r/>
-                  <w:r>
-                    <w:rPr>
-                      <w:b w:val="0"/>
+                  <w:tcW w:w="3422" w:type="dxa"/>
+                  <w:vAlign w:val="center"/>
+                </w:tcPr>
+                <w:p>
+                  <w:pPr>
+                    <w:spacing w:after="40"/>
+                  </w:pPr>
+                  <w:r>
+                    <w:rPr>
                       <w:sz w:val="16"/>
                     </w:rPr>
                     <w:t>Worker consume y entrega la comanda al comerciante.</w:t>
@@ -2450,17 +2378,15 @@
               </w:tc>
               <w:tc>
                 <w:tcPr>
-                  <w:tcW w:type="dxa" w:w="3422"/>
-                  <w:vAlign w:val="center"/>
-                </w:tcPr>
-                <w:p>
-                  <w:pPr>
-                    <w:spacing w:after="40"/>
-                  </w:pPr>
-                  <w:r/>
-                  <w:r>
-                    <w:rPr>
-                      <w:b w:val="0"/>
+                  <w:tcW w:w="3422" w:type="dxa"/>
+                  <w:vAlign w:val="center"/>
+                </w:tcPr>
+                <w:p>
+                  <w:pPr>
+                    <w:spacing w:after="40"/>
+                  </w:pPr>
+                  <w:r>
+                    <w:rPr>
                       <w:sz w:val="16"/>
                     </w:rPr>
                     <w:t>Redis + HTTPS wa.me</w:t>
@@ -2471,18 +2397,16 @@
             <w:tr>
               <w:tc>
                 <w:tcPr>
-                  <w:tcW w:type="dxa" w:w="3422"/>
-                  <w:vAlign w:val="center"/>
-                  <w:shd w:fill="EAF2F8"/>
-                </w:tcPr>
-                <w:p>
-                  <w:pPr>
-                    <w:spacing w:after="40"/>
-                  </w:pPr>
-                  <w:r/>
-                  <w:r>
-                    <w:rPr>
-                      <w:b w:val="0"/>
+                  <w:tcW w:w="3422" w:type="dxa"/>
+                  <w:shd w:val="clear" w:color="auto" w:fill="EAF2F8"/>
+                  <w:vAlign w:val="center"/>
+                </w:tcPr>
+                <w:p>
+                  <w:pPr>
+                    <w:spacing w:after="40"/>
+                  </w:pPr>
+                  <w:r>
+                    <w:rPr>
                       <w:sz w:val="16"/>
                     </w:rPr>
                     <w:t>10</w:t>
@@ -2491,18 +2415,16 @@
               </w:tc>
               <w:tc>
                 <w:tcPr>
-                  <w:tcW w:type="dxa" w:w="3422"/>
-                  <w:vAlign w:val="center"/>
-                  <w:shd w:fill="EAF2F8"/>
-                </w:tcPr>
-                <w:p>
-                  <w:pPr>
-                    <w:spacing w:after="40"/>
-                  </w:pPr>
-                  <w:r/>
-                  <w:r>
-                    <w:rPr>
-                      <w:b w:val="0"/>
+                  <w:tcW w:w="3422" w:type="dxa"/>
+                  <w:shd w:val="clear" w:color="auto" w:fill="EAF2F8"/>
+                  <w:vAlign w:val="center"/>
+                </w:tcPr>
+                <w:p>
+                  <w:pPr>
+                    <w:spacing w:after="40"/>
+                  </w:pPr>
+                  <w:r>
+                    <w:rPr>
                       <w:sz w:val="16"/>
                     </w:rPr>
                     <w:t>API devuelve confirmación a la PWA.</w:t>
@@ -2511,18 +2433,16 @@
               </w:tc>
               <w:tc>
                 <w:tcPr>
-                  <w:tcW w:type="dxa" w:w="3422"/>
-                  <w:vAlign w:val="center"/>
-                  <w:shd w:fill="EAF2F8"/>
-                </w:tcPr>
-                <w:p>
-                  <w:pPr>
-                    <w:spacing w:after="40"/>
-                  </w:pPr>
-                  <w:r/>
-                  <w:r>
-                    <w:rPr>
-                      <w:b w:val="0"/>
+                  <w:tcW w:w="3422" w:type="dxa"/>
+                  <w:shd w:val="clear" w:color="auto" w:fill="EAF2F8"/>
+                  <w:vAlign w:val="center"/>
+                </w:tcPr>
+                <w:p>
+                  <w:pPr>
+                    <w:spacing w:after="40"/>
+                  </w:pPr>
+                  <w:r>
+                    <w:rPr>
                       <w:sz w:val="16"/>
                     </w:rPr>
                     <w:t>HTTPS/JSON</w:t>
@@ -2601,7 +2521,14 @@
               <w:rPr>
                 <w:sz w:val="18"/>
               </w:rPr>
-              <w:t>La lista de revisión verificó título, alcance, leyenda, tipos, descripciones, tecnologías y protocolos en cada vista. Se identificaron dos falsos positivos: modelar WhatsApp Cloud API como integración obligatoria y modelar Docker Compose como contenedor C4. Ambos fueron rechazados por ADR-003 y por la definición de contenedor de la guía. También se corrigió un selector inválido de componentes detectado por Structurizr CLI.</w:t>
+              <w:t xml:space="preserve">La lista de revisión verificó título, alcance, leyenda, tipos, descripciones, tecnologías y protocolos en cada vista. Se identificaron dos falsos positivos: modelar WhatsApp Cloud API como integración obligatoria y modelar Docker Compose como contenedor C4. Ambos fueron </w:t>
+            </w:r>
+            <w:r>
+              <w:rPr>
+                <w:sz w:val="18"/>
+              </w:rPr>
+              <w:lastRenderedPageBreak/>
+              <w:t>rechazados por ADR-003 y por la definición de contenedor de la guía. También se corrigió un selector inválido de componentes detectado por Structurizr CLI.</w:t>
             </w:r>
           </w:p>
           <w:p>
@@ -2646,18 +2573,137 @@
               <w:jc w:val="center"/>
             </w:pPr>
             <w:r>
+              <w:rPr>
+                <w:noProof/>
+              </w:rPr>
               <w:drawing>
-                <wp:inline xmlns:a="http://schemas.openxmlformats.org/drawingml/2006/main" xmlns:pic="http://schemas.openxmlformats.org/drawingml/2006/picture">
+                <wp:inline distT="0" distB="0" distL="0" distR="0" wp14:anchorId="7BB7BC9A" wp14:editId="52CB51D6">
                   <wp:extent cx="5166360" cy="2696004"/>
+                  <wp:effectExtent l="0" t="0" r="0" b="0"/>
                   <wp:docPr id="1" name="Picture 1" descr="Image: image3.png"/>
                   <wp:cNvGraphicFramePr>
-                    <a:graphicFrameLocks noChangeAspect="1"/>
+                    <a:graphicFrameLocks xmlns:a="http://schemas.openxmlformats.org/drawingml/2006/main" noChangeAspect="1"/>
                   </wp:cNvGraphicFramePr>
-                  <a:graphic>
+                  <a:graphic xmlns:a="http://schemas.openxmlformats.org/drawingml/2006/main">
                     <a:graphicData uri="http://schemas.openxmlformats.org/drawingml/2006/picture">
-                      <pic:pic>
+                      <pic:pic xmlns:pic="http://schemas.openxmlformats.org/drawingml/2006/picture">
                         <pic:nvPicPr>
                           <pic:cNvPr id="0" name="structurizr-systemContext.png"/>
+                          <pic:cNvPicPr/>
+                        </pic:nvPicPr>
+                        <pic:blipFill>
+                          <a:blip r:embed="rId9"/>
+                          <a:stretch>
+                            <a:fillRect/>
+                          </a:stretch>
+                        </pic:blipFill>
+                        <pic:spPr>
+                          <a:xfrm>
+                            <a:off x="0" y="0"/>
+                            <a:ext cx="5166360" cy="2696004"/>
+                          </a:xfrm>
+                          <a:prstGeom prst="rect">
+                            <a:avLst/>
+                          </a:prstGeom>
+                        </pic:spPr>
+                      </pic:pic>
+                    </a:graphicData>
+                  </a:graphic>
+                </wp:inline>
+              </w:drawing>
+            </w:r>
+          </w:p>
+          <w:p>
+            <w:pPr>
+              <w:jc w:val="center"/>
+            </w:pPr>
+            <w:r>
+              <w:rPr>
+                <w:i/>
+                <w:sz w:val="16"/>
+              </w:rPr>
+              <w:t>Figura 1. Vista de contexto del sistema.</w:t>
+            </w:r>
+          </w:p>
+          <w:p>
+            <w:pPr>
+              <w:jc w:val="center"/>
+            </w:pPr>
+            <w:r>
+              <w:rPr>
+                <w:noProof/>
+              </w:rPr>
+              <w:drawing>
+                <wp:inline distT="0" distB="0" distL="0" distR="0" wp14:anchorId="5D0F5C2D" wp14:editId="31501798">
+                  <wp:extent cx="5166360" cy="3716526"/>
+                  <wp:effectExtent l="0" t="0" r="0" b="0"/>
+                  <wp:docPr id="2" name="Picture 2" descr="Image: image4.png"/>
+                  <wp:cNvGraphicFramePr>
+                    <a:graphicFrameLocks xmlns:a="http://schemas.openxmlformats.org/drawingml/2006/main" noChangeAspect="1"/>
+                  </wp:cNvGraphicFramePr>
+                  <a:graphic xmlns:a="http://schemas.openxmlformats.org/drawingml/2006/main">
+                    <a:graphicData uri="http://schemas.openxmlformats.org/drawingml/2006/picture">
+                      <pic:pic xmlns:pic="http://schemas.openxmlformats.org/drawingml/2006/picture">
+                        <pic:nvPicPr>
+                          <pic:cNvPr id="0" name="structurizr-container.png"/>
+                          <pic:cNvPicPr/>
+                        </pic:nvPicPr>
+                        <pic:blipFill>
+                          <a:blip r:embed="rId10"/>
+                          <a:stretch>
+                            <a:fillRect/>
+                          </a:stretch>
+                        </pic:blipFill>
+                        <pic:spPr>
+                          <a:xfrm>
+                            <a:off x="0" y="0"/>
+                            <a:ext cx="5166360" cy="3716526"/>
+                          </a:xfrm>
+                          <a:prstGeom prst="rect">
+                            <a:avLst/>
+                          </a:prstGeom>
+                        </pic:spPr>
+                      </pic:pic>
+                    </a:graphicData>
+                  </a:graphic>
+                </wp:inline>
+              </w:drawing>
+            </w:r>
+          </w:p>
+          <w:p>
+            <w:pPr>
+              <w:jc w:val="center"/>
+            </w:pPr>
+            <w:r>
+              <w:rPr>
+                <w:i/>
+                <w:sz w:val="16"/>
+              </w:rPr>
+              <w:t>Figura 2. Vista de contenedores.</w:t>
+            </w:r>
+          </w:p>
+          <w:p>
+            <w:pPr>
+              <w:jc w:val="center"/>
+            </w:pPr>
+            <w:r>
+              <w:rPr>
+                <w:noProof/>
+              </w:rPr>
+              <w:lastRenderedPageBreak/>
+              <w:drawing>
+                <wp:inline distT="0" distB="0" distL="0" distR="0" wp14:anchorId="68A5F59D" wp14:editId="41CC683E">
+                  <wp:extent cx="5166360" cy="2474302"/>
+                  <wp:effectExtent l="0" t="0" r="0" b="0"/>
+                  <wp:docPr id="3" name="Picture 3" descr="Image: image5.png"/>
+                  <wp:cNvGraphicFramePr>
+                    <a:graphicFrameLocks xmlns:a="http://schemas.openxmlformats.org/drawingml/2006/main" noChangeAspect="1"/>
+                  </wp:cNvGraphicFramePr>
+                  <a:graphic xmlns:a="http://schemas.openxmlformats.org/drawingml/2006/main">
+                    <a:graphicData uri="http://schemas.openxmlformats.org/drawingml/2006/picture">
+                      <pic:pic xmlns:pic="http://schemas.openxmlformats.org/drawingml/2006/picture">
+                        <pic:nvPicPr>
+                          <pic:cNvPr id="0" name="structurizr-componentApi.png"/>
                           <pic:cNvPicPr/>
                         </pic:nvPicPr>
                         <pic:blipFill>
@@ -2669,9 +2715,11 @@
                         <pic:spPr>
                           <a:xfrm>
                             <a:off x="0" y="0"/>
-                            <a:ext cx="5166360" cy="2696004"/>
+                            <a:ext cx="5166360" cy="2474302"/>
                           </a:xfrm>
-                          <a:prstGeom prst="rect"/>
+                          <a:prstGeom prst="rect">
+                            <a:avLst/>
+                          </a:prstGeom>
                         </pic:spPr>
                       </pic:pic>
                     </a:graphicData>
@@ -2689,7 +2737,7 @@
                 <w:i/>
                 <w:sz w:val="16"/>
               </w:rPr>
-              <w:t>Figura 1. Vista de contexto del sistema.</w:t>
+              <w:t>Figura 3. Vista de componentes de la API.</w:t>
             </w:r>
           </w:p>
           <w:p>
@@ -2697,18 +2745,22 @@
               <w:jc w:val="center"/>
             </w:pPr>
             <w:r>
+              <w:rPr>
+                <w:noProof/>
+              </w:rPr>
               <w:drawing>
-                <wp:inline xmlns:a="http://schemas.openxmlformats.org/drawingml/2006/main" xmlns:pic="http://schemas.openxmlformats.org/drawingml/2006/picture">
-                  <wp:extent cx="5166360" cy="3716526"/>
-                  <wp:docPr id="2" name="Picture 2" descr="Image: image4.png"/>
+                <wp:inline distT="0" distB="0" distL="0" distR="0" wp14:anchorId="59C7F50E" wp14:editId="6710EE74">
+                  <wp:extent cx="5166360" cy="1733968"/>
+                  <wp:effectExtent l="0" t="0" r="0" b="0"/>
+                  <wp:docPr id="4" name="Picture 4" descr="Image: image6.png"/>
                   <wp:cNvGraphicFramePr>
-                    <a:graphicFrameLocks noChangeAspect="1"/>
+                    <a:graphicFrameLocks xmlns:a="http://schemas.openxmlformats.org/drawingml/2006/main" noChangeAspect="1"/>
                   </wp:cNvGraphicFramePr>
-                  <a:graphic>
+                  <a:graphic xmlns:a="http://schemas.openxmlformats.org/drawingml/2006/main">
                     <a:graphicData uri="http://schemas.openxmlformats.org/drawingml/2006/picture">
-                      <pic:pic>
+                      <pic:pic xmlns:pic="http://schemas.openxmlformats.org/drawingml/2006/picture">
                         <pic:nvPicPr>
-                          <pic:cNvPr id="0" name="structurizr-container.png"/>
+                          <pic:cNvPr id="0" name="structurizr-confirmarYape.png"/>
                           <pic:cNvPicPr/>
                         </pic:nvPicPr>
                         <pic:blipFill>
@@ -2720,9 +2772,11 @@
                         <pic:spPr>
                           <a:xfrm>
                             <a:off x="0" y="0"/>
-                            <a:ext cx="5166360" cy="3716526"/>
+                            <a:ext cx="5166360" cy="1733968"/>
                           </a:xfrm>
-                          <a:prstGeom prst="rect"/>
+                          <a:prstGeom prst="rect">
+                            <a:avLst/>
+                          </a:prstGeom>
                         </pic:spPr>
                       </pic:pic>
                     </a:graphicData>
@@ -2740,7 +2794,7 @@
                 <w:i/>
                 <w:sz w:val="16"/>
               </w:rPr>
-              <w:t>Figura 2. Vista de contenedores.</w:t>
+              <w:t>Figura 4. Vista dinámica de confirmar y pagar con Yape.</w:t>
             </w:r>
           </w:p>
           <w:p>
@@ -2748,18 +2802,22 @@
               <w:jc w:val="center"/>
             </w:pPr>
             <w:r>
+              <w:rPr>
+                <w:noProof/>
+              </w:rPr>
               <w:drawing>
-                <wp:inline xmlns:a="http://schemas.openxmlformats.org/drawingml/2006/main" xmlns:pic="http://schemas.openxmlformats.org/drawingml/2006/picture">
-                  <wp:extent cx="5166360" cy="2474302"/>
-                  <wp:docPr id="3" name="Picture 3" descr="Image: image5.png"/>
+                <wp:inline distT="0" distB="0" distL="0" distR="0" wp14:anchorId="0F98C637" wp14:editId="72F8D8EF">
+                  <wp:extent cx="5166360" cy="1251144"/>
+                  <wp:effectExtent l="0" t="0" r="0" b="0"/>
+                  <wp:docPr id="5" name="Picture 5" descr="Image: image7.png"/>
                   <wp:cNvGraphicFramePr>
-                    <a:graphicFrameLocks noChangeAspect="1"/>
+                    <a:graphicFrameLocks xmlns:a="http://schemas.openxmlformats.org/drawingml/2006/main" noChangeAspect="1"/>
                   </wp:cNvGraphicFramePr>
-                  <a:graphic>
+                  <a:graphic xmlns:a="http://schemas.openxmlformats.org/drawingml/2006/main">
                     <a:graphicData uri="http://schemas.openxmlformats.org/drawingml/2006/picture">
-                      <pic:pic>
+                      <pic:pic xmlns:pic="http://schemas.openxmlformats.org/drawingml/2006/picture">
                         <pic:nvPicPr>
-                          <pic:cNvPr id="0" name="structurizr-componentApi.png"/>
+                          <pic:cNvPr id="0" name="structurizr-deploymentProduccion.png"/>
                           <pic:cNvPicPr/>
                         </pic:nvPicPr>
                         <pic:blipFill>
@@ -2771,111 +2829,11 @@
                         <pic:spPr>
                           <a:xfrm>
                             <a:off x="0" y="0"/>
-                            <a:ext cx="5166360" cy="2474302"/>
-                          </a:xfrm>
-                          <a:prstGeom prst="rect"/>
-                        </pic:spPr>
-                      </pic:pic>
-                    </a:graphicData>
-                  </a:graphic>
-                </wp:inline>
-              </w:drawing>
-            </w:r>
-          </w:p>
-          <w:p>
-            <w:pPr>
-              <w:jc w:val="center"/>
-            </w:pPr>
-            <w:r>
-              <w:rPr>
-                <w:i/>
-                <w:sz w:val="16"/>
-              </w:rPr>
-              <w:t>Figura 3. Vista de componentes de la API.</w:t>
-            </w:r>
-          </w:p>
-          <w:p>
-            <w:pPr>
-              <w:jc w:val="center"/>
-            </w:pPr>
-            <w:r>
-              <w:drawing>
-                <wp:inline xmlns:a="http://schemas.openxmlformats.org/drawingml/2006/main" xmlns:pic="http://schemas.openxmlformats.org/drawingml/2006/picture">
-                  <wp:extent cx="5166360" cy="1733968"/>
-                  <wp:docPr id="4" name="Picture 4" descr="Image: image6.png"/>
-                  <wp:cNvGraphicFramePr>
-                    <a:graphicFrameLocks noChangeAspect="1"/>
-                  </wp:cNvGraphicFramePr>
-                  <a:graphic>
-                    <a:graphicData uri="http://schemas.openxmlformats.org/drawingml/2006/picture">
-                      <pic:pic>
-                        <pic:nvPicPr>
-                          <pic:cNvPr id="0" name="structurizr-confirmarYape.png"/>
-                          <pic:cNvPicPr/>
-                        </pic:nvPicPr>
-                        <pic:blipFill>
-                          <a:blip r:embed="rId14"/>
-                          <a:stretch>
-                            <a:fillRect/>
-                          </a:stretch>
-                        </pic:blipFill>
-                        <pic:spPr>
-                          <a:xfrm>
-                            <a:off x="0" y="0"/>
-                            <a:ext cx="5166360" cy="1733968"/>
-                          </a:xfrm>
-                          <a:prstGeom prst="rect"/>
-                        </pic:spPr>
-                      </pic:pic>
-                    </a:graphicData>
-                  </a:graphic>
-                </wp:inline>
-              </w:drawing>
-            </w:r>
-          </w:p>
-          <w:p>
-            <w:pPr>
-              <w:jc w:val="center"/>
-            </w:pPr>
-            <w:r>
-              <w:rPr>
-                <w:i/>
-                <w:sz w:val="16"/>
-              </w:rPr>
-              <w:t>Figura 4. Vista dinámica de confirmar y pagar con Yape.</w:t>
-            </w:r>
-          </w:p>
-          <w:p>
-            <w:pPr>
-              <w:jc w:val="center"/>
-            </w:pPr>
-            <w:r>
-              <w:drawing>
-                <wp:inline xmlns:a="http://schemas.openxmlformats.org/drawingml/2006/main" xmlns:pic="http://schemas.openxmlformats.org/drawingml/2006/picture">
-                  <wp:extent cx="5166360" cy="1251144"/>
-                  <wp:docPr id="5" name="Picture 5" descr="Image: image7.png"/>
-                  <wp:cNvGraphicFramePr>
-                    <a:graphicFrameLocks noChangeAspect="1"/>
-                  </wp:cNvGraphicFramePr>
-                  <a:graphic>
-                    <a:graphicData uri="http://schemas.openxmlformats.org/drawingml/2006/picture">
-                      <pic:pic>
-                        <pic:nvPicPr>
-                          <pic:cNvPr id="0" name="structurizr-deploymentProduccion.png"/>
-                          <pic:cNvPicPr/>
-                        </pic:nvPicPr>
-                        <pic:blipFill>
-                          <a:blip r:embed="rId15"/>
-                          <a:stretch>
-                            <a:fillRect/>
-                          </a:stretch>
-                        </pic:blipFill>
-                        <pic:spPr>
-                          <a:xfrm>
-                            <a:off x="0" y="0"/>
                             <a:ext cx="5166360" cy="1251144"/>
                           </a:xfrm>
-                          <a:prstGeom prst="rect"/>
+                          <a:prstGeom prst="rect">
+                            <a:avLst/>
+                          </a:prstGeom>
                         </pic:spPr>
                       </pic:pic>
                     </a:graphicData>
@@ -2906,9 +2864,7 @@
           <w:tcPr>
             <w:tcW w:w="10266" w:type="dxa"/>
           </w:tcPr>
-          <w:p>
-            <w:r/>
-          </w:p>
+          <w:p/>
           <w:p>
             <w:pPr>
               <w:spacing w:before="160" w:after="60"/>
@@ -2933,11 +2889,6 @@
               </w:rPr>
               <w:t>1. ¿Qué problema resuelve C4?</w:t>
             </w:r>
-            <w:r>
-              <w:rPr>
-                <w:sz w:val="18"/>
-              </w:rPr>
-            </w:r>
           </w:p>
           <w:p>
             <w:pPr>
@@ -2961,11 +2912,6 @@
               </w:rPr>
               <w:t>2. ¿Qué es un contenedor C4?</w:t>
             </w:r>
-            <w:r>
-              <w:rPr>
-                <w:sz w:val="18"/>
-              </w:rPr>
-            </w:r>
           </w:p>
           <w:p>
             <w:pPr>
@@ -2989,11 +2935,6 @@
               </w:rPr>
               <w:t>3. ¿Qué público tiene cada nivel?</w:t>
             </w:r>
-            <w:r>
-              <w:rPr>
-                <w:sz w:val="18"/>
-              </w:rPr>
-            </w:r>
           </w:p>
           <w:p>
             <w:pPr>
@@ -3017,20 +2958,16 @@
               </w:rPr>
               <w:t>4. ¿Dinámica C4 o secuencia UML?</w:t>
             </w:r>
+          </w:p>
+          <w:p>
+            <w:pPr>
+              <w:spacing w:after="100" w:line="259" w:lineRule="auto"/>
+            </w:pPr>
             <w:r>
               <w:rPr>
                 <w:sz w:val="18"/>
               </w:rPr>
-            </w:r>
-          </w:p>
-          <w:p>
-            <w:pPr>
-              <w:spacing w:after="100" w:line="259" w:lineRule="auto"/>
-            </w:pPr>
-            <w:r>
-              <w:rPr>
-                <w:sz w:val="18"/>
-              </w:rPr>
+              <w:lastRenderedPageBreak/>
               <w:t>C4 dinámica resume la colaboración arquitectónica entre contenedores y componentes. La secuencia UML detalla objetos, operaciones, activaciones y ramas del dominio. Se usan juntas para explicar y luego implementar el flujo.</w:t>
             </w:r>
           </w:p>
@@ -3045,11 +2982,6 @@
               </w:rPr>
               <w:t>5. ¿Ventaja de Structurizr DSL?</w:t>
             </w:r>
-            <w:r>
-              <w:rPr>
-                <w:sz w:val="18"/>
-              </w:rPr>
-            </w:r>
           </w:p>
           <w:p>
             <w:pPr>
@@ -3073,11 +3005,6 @@
               </w:rPr>
               <w:t>6. ¿Qué elementos justifica ADR-001?</w:t>
             </w:r>
-            <w:r>
-              <w:rPr>
-                <w:sz w:val="18"/>
-              </w:rPr>
-            </w:r>
           </w:p>
           <w:p>
             <w:pPr>
@@ -3101,11 +3028,6 @@
               </w:rPr>
               <w:t>7. ¿Qué error de IA se detectó?</w:t>
             </w:r>
-            <w:r>
-              <w:rPr>
-                <w:sz w:val="18"/>
-              </w:rPr>
-            </w:r>
           </w:p>
           <w:p>
             <w:pPr>
@@ -3128,11 +3050,6 @@
                 <w:sz w:val="18"/>
               </w:rPr>
               <w:t>8. ¿Cómo adaptar la explicación?</w:t>
-            </w:r>
-            <w:r>
-              <w:rPr>
-                <w:sz w:val="18"/>
-              </w:rPr>
             </w:r>
           </w:p>
           <w:p>
@@ -3159,9 +3076,7 @@
               <w:bottom w:val="single" w:sz="4" w:space="0" w:color="000000"/>
             </w:tcBorders>
           </w:tcPr>
-          <w:p>
-            <w:r/>
-          </w:p>
+          <w:p/>
           <w:p>
             <w:pPr>
               <w:spacing w:before="160" w:after="60"/>
@@ -3299,9 +3214,7 @@
               <w:bottom w:val="single" w:sz="4" w:space="0" w:color="000000"/>
             </w:tcBorders>
           </w:tcPr>
-          <w:p>
-            <w:r/>
-          </w:p>
+          <w:p/>
           <w:p>
             <w:pPr>
               <w:spacing w:after="100" w:line="259" w:lineRule="auto"/>
@@ -3379,9 +3292,7 @@
           <w:tcPr>
             <w:tcW w:w="10266" w:type="dxa"/>
           </w:tcPr>
-          <w:p>
-            <w:r/>
-          </w:p>
+          <w:p/>
           <w:p>
             <w:pPr>
               <w:spacing w:before="160" w:after="60"/>
@@ -3464,7 +3375,7 @@
       </w:pPr>
     </w:p>
     <w:sectPr>
-      <w:headerReference w:type="default" r:id="rId8"/>
+      <w:headerReference w:type="default" r:id="rId14"/>
       <w:pgSz w:w="11906" w:h="16838"/>
       <w:pgMar w:top="792" w:right="936" w:bottom="792" w:left="936" w:header="708" w:footer="708" w:gutter="0"/>
       <w:pgNumType w:start="1"/>
@@ -3599,7 +3510,7 @@
               <wp:inline distT="0" distB="0" distL="0" distR="0" wp14:anchorId="24A408E4" wp14:editId="43F5EACB">
                 <wp:extent cx="1526357" cy="628967"/>
                 <wp:effectExtent l="0" t="0" r="0" b="0"/>
-                <wp:docPr id="1" name="image2.png" descr="Programación Web 1"/>
+                <wp:docPr id="1610620376" name="image2.png" descr="Programación Web 1"/>
                 <wp:cNvGraphicFramePr/>
                 <a:graphic xmlns:a="http://schemas.openxmlformats.org/drawingml/2006/main">
                   <a:graphicData uri="http://schemas.openxmlformats.org/drawingml/2006/picture">
@@ -3774,7 +3685,7 @@
               <wp:inline distT="0" distB="0" distL="0" distR="0" wp14:anchorId="4C3D5107" wp14:editId="675A46DE">
                 <wp:extent cx="506381" cy="506381"/>
                 <wp:effectExtent l="0" t="0" r="0" b="0"/>
-                <wp:docPr id="2" name="image1.png" descr="Image: numbering.xml"/>
+                <wp:docPr id="1418757833" name="image1.png" descr="Image: numbering.xml"/>
                 <wp:cNvGraphicFramePr/>
                 <a:graphic xmlns:a="http://schemas.openxmlformats.org/drawingml/2006/main">
                   <a:graphicData uri="http://schemas.openxmlformats.org/drawingml/2006/picture">
@@ -4890,6 +4801,41 @@
       </w:tblCellMar>
     </w:tblPr>
   </w:style>
+  <w:style w:type="character" w:styleId="Hipervnculo">
+    <w:name w:val="Hyperlink"/>
+    <w:basedOn w:val="Fuentedeprrafopredeter"/>
+    <w:uiPriority w:val="99"/>
+    <w:unhideWhenUsed/>
+    <w:rsid w:val="0098072D"/>
+    <w:rPr>
+      <w:color w:val="0000FF" w:themeColor="hyperlink"/>
+      <w:u w:val="single"/>
+    </w:rPr>
+  </w:style>
+  <w:style w:type="character" w:styleId="Mencinsinresolver">
+    <w:name w:val="Unresolved Mention"/>
+    <w:basedOn w:val="Fuentedeprrafopredeter"/>
+    <w:uiPriority w:val="99"/>
+    <w:semiHidden/>
+    <w:unhideWhenUsed/>
+    <w:rsid w:val="0098072D"/>
+    <w:rPr>
+      <w:color w:val="605E5C"/>
+      <w:shd w:val="clear" w:color="auto" w:fill="E1DFDD"/>
+    </w:rPr>
+  </w:style>
+  <w:style w:type="character" w:styleId="Hipervnculovisitado">
+    <w:name w:val="FollowedHyperlink"/>
+    <w:basedOn w:val="Fuentedeprrafopredeter"/>
+    <w:uiPriority w:val="99"/>
+    <w:semiHidden/>
+    <w:unhideWhenUsed/>
+    <w:rsid w:val="0098072D"/>
+    <w:rPr>
+      <w:color w:val="800080" w:themeColor="followedHyperlink"/>
+      <w:u w:val="single"/>
+    </w:rPr>
+  </w:style>
 </w:styles>
 </file>
 

</xml_diff>